<commit_message>
upload the AI declaration file
</commit_message>
<xml_diff>
--- a/230482_YangLiu_CA1_Strategic_Thinking_Final Proposal.docx
+++ b/230482_YangLiu_CA1_Strategic_Thinking_Final Proposal.docx
@@ -1172,6 +1172,7 @@
             <w:pStyle w:val="TOCHeading"/>
             <w:rPr>
               <w:rFonts w:ascii="Times New Roman" w:hAnsi="Times New Roman" w:cs="Times New Roman"/>
+              <w:color w:val="auto"/>
               <w:sz w:val="36"/>
               <w:szCs w:val="36"/>
             </w:rPr>
@@ -1185,24 +1186,23 @@
             </w:rPr>
             <w:t>Contents</w:t>
           </w:r>
-        </w:p>
-        <w:p>
-          <w:pPr>
-            <w:pStyle w:val="TOC1"/>
-            <w:spacing w:line="276" w:lineRule="auto"/>
+          <w:r>
             <w:rPr>
-              <w:rFonts w:eastAsia="SimSun"/>
-              <w:noProof/>
-              <w:lang w:eastAsia="zh-CN"/>
+              <w:rFonts w:asciiTheme="minorHAnsi" w:hAnsiTheme="minorHAnsi" w:cstheme="minorBidi"/>
+              <w:b w:val="0"/>
+              <w:bCs w:val="0"/>
             </w:rPr>
-          </w:pPr>
-          <w:r>
             <w:fldChar w:fldCharType="begin"/>
           </w:r>
           <w:r>
             <w:instrText xml:space="preserve"> TOC \o "1-3" \h \z \u </w:instrText>
           </w:r>
           <w:r>
+            <w:rPr>
+              <w:rFonts w:asciiTheme="minorHAnsi" w:hAnsiTheme="minorHAnsi" w:cstheme="minorBidi"/>
+              <w:b w:val="0"/>
+              <w:bCs w:val="0"/>
+            </w:rPr>
             <w:fldChar w:fldCharType="separate"/>
           </w:r>
         </w:p>
@@ -2869,13 +2869,6 @@
         </w:p>
         <w:p>
           <w:pPr>
-            <w:rPr>
-              <w:lang w:eastAsia="zh-CN"/>
-            </w:rPr>
-          </w:pPr>
-        </w:p>
-        <w:p>
-          <w:pPr>
             <w:pStyle w:val="TOC1"/>
             <w:spacing w:line="276" w:lineRule="auto"/>
             <w:rPr>
@@ -2908,88 +2901,6 @@
               <w:t>6</w:t>
             </w:r>
           </w:hyperlink>
-        </w:p>
-        <w:p>
-          <w:pPr>
-            <w:pStyle w:val="TOC1"/>
-            <w:spacing w:line="276" w:lineRule="auto"/>
-            <w:rPr>
-              <w:noProof/>
-            </w:rPr>
-          </w:pPr>
-          <w:hyperlink w:anchor="_Toc243498906" w:history="1">
-            <w:r>
-              <w:rPr>
-                <w:rStyle w:val="Hyperlink"/>
-                <w:rFonts w:ascii="Times New Roman" w:hAnsi="Times New Roman" w:cs="Times New Roman"/>
-                <w:noProof/>
-              </w:rPr>
-              <w:t>Appendix</w:t>
-            </w:r>
-            <w:r>
-              <w:rPr>
-                <w:noProof/>
-                <w:webHidden/>
-              </w:rPr>
-              <w:tab/>
-            </w:r>
-            <w:r>
-              <w:rPr>
-                <w:rFonts w:eastAsia="SimSun" w:hint="eastAsia"/>
-                <w:noProof/>
-                <w:webHidden/>
-                <w:lang w:eastAsia="zh-CN"/>
-              </w:rPr>
-              <w:t>7</w:t>
-            </w:r>
-          </w:hyperlink>
-        </w:p>
-        <w:p>
-          <w:pPr>
-            <w:pStyle w:val="TOC2"/>
-            <w:tabs>
-              <w:tab w:val="right" w:leader="dot" w:pos="8636"/>
-            </w:tabs>
-            <w:rPr>
-              <w:rFonts w:ascii="Times New Roman" w:eastAsia="SimSun" w:hAnsi="Times New Roman" w:cs="Times New Roman"/>
-              <w:noProof/>
-              <w:lang w:eastAsia="zh-CN"/>
-            </w:rPr>
-          </w:pPr>
-          <w:hyperlink w:anchor="_Toc243498907" w:history="1">
-            <w:r>
-              <w:rPr>
-                <w:rStyle w:val="Hyperlink"/>
-                <w:rFonts w:ascii="Times New Roman" w:hAnsi="Times New Roman" w:cs="Times New Roman"/>
-                <w:noProof/>
-              </w:rPr>
-              <w:t>Use of AI Tools</w:t>
-            </w:r>
-            <w:r>
-              <w:rPr>
-                <w:rFonts w:ascii="Times New Roman" w:hAnsi="Times New Roman" w:cs="Times New Roman"/>
-                <w:noProof/>
-                <w:webHidden/>
-              </w:rPr>
-              <w:tab/>
-            </w:r>
-            <w:r>
-              <w:rPr>
-                <w:rFonts w:ascii="Times New Roman" w:hAnsi="Times New Roman" w:cs="Times New Roman"/>
-                <w:noProof/>
-                <w:webHidden/>
-              </w:rPr>
-              <w:t>7</w:t>
-            </w:r>
-          </w:hyperlink>
-          <w:r>
-            <w:rPr>
-              <w:rFonts w:ascii="Times New Roman" w:eastAsia="SimSun" w:hAnsi="Times New Roman" w:cs="Times New Roman" w:hint="eastAsia"/>
-              <w:noProof/>
-              <w:lang w:eastAsia="zh-CN"/>
-            </w:rPr>
-            <w:t>-11</w:t>
-          </w:r>
         </w:p>
         <w:p>
           <w:pPr>
@@ -5165,2585 +5076,12 @@
         </w:rPr>
       </w:pPr>
     </w:p>
-    <w:p>
-      <w:pPr>
-        <w:pStyle w:val="Heading1"/>
-        <w:rPr>
-          <w:rFonts w:ascii="Times New Roman" w:eastAsia="SimSun" w:hAnsi="Times New Roman" w:cs="Times New Roman"/>
-          <w:color w:val="auto"/>
-          <w:sz w:val="36"/>
-          <w:szCs w:val="36"/>
-          <w:lang w:eastAsia="zh-CN"/>
-        </w:rPr>
-      </w:pPr>
-      <w:bookmarkStart w:id="33" w:name="_Toc243498906"/>
-      <w:r>
-        <w:rPr>
-          <w:rFonts w:ascii="Times New Roman" w:hAnsi="Times New Roman" w:cs="Times New Roman"/>
-          <w:color w:val="auto"/>
-          <w:sz w:val="36"/>
-          <w:szCs w:val="36"/>
-        </w:rPr>
-        <w:lastRenderedPageBreak/>
-        <w:t>Appendix</w:t>
-      </w:r>
-      <w:bookmarkEnd w:id="33"/>
-    </w:p>
-    <w:p>
-      <w:pPr>
-        <w:rPr>
-          <w:rFonts w:eastAsia="SimSun"/>
-          <w:lang w:eastAsia="zh-CN"/>
-        </w:rPr>
-      </w:pPr>
-    </w:p>
-    <w:p>
-      <w:pPr>
-        <w:rPr>
-          <w:rFonts w:ascii="Times New Roman" w:hAnsi="Times New Roman" w:cs="Times New Roman"/>
-          <w:sz w:val="28"/>
-          <w:szCs w:val="28"/>
-        </w:rPr>
-      </w:pPr>
-      <w:r>
-        <w:rPr>
-          <w:rFonts w:ascii="Times New Roman" w:hAnsi="Times New Roman" w:cs="Times New Roman"/>
-          <w:b/>
-          <w:sz w:val="32"/>
-          <w:szCs w:val="32"/>
-        </w:rPr>
-        <w:t>Use of AI Tools</w:t>
-      </w:r>
-    </w:p>
-    <w:p>
-      <w:pPr>
-        <w:rPr>
-          <w:rFonts w:ascii="Times New Roman" w:hAnsi="Times New Roman" w:cs="Times New Roman"/>
-          <w:sz w:val="28"/>
-          <w:szCs w:val="28"/>
-        </w:rPr>
-      </w:pPr>
-      <w:r>
-        <w:rPr>
-          <w:rFonts w:ascii="Times New Roman" w:hAnsi="Times New Roman" w:cs="Times New Roman"/>
-          <w:sz w:val="28"/>
-          <w:szCs w:val="28"/>
-        </w:rPr>
-        <w:t>I acknowledge the use of [Gemini] for the purpose of [data masking</w:t>
-      </w:r>
-      <w:r>
-        <w:rPr>
-          <w:rFonts w:ascii="Times New Roman" w:hAnsi="Times New Roman" w:cs="Times New Roman"/>
-          <w:sz w:val="28"/>
-          <w:szCs w:val="28"/>
-          <w:lang w:eastAsia="zh-CN"/>
-        </w:rPr>
-        <w:t>,</w:t>
-      </w:r>
-      <w:r>
-        <w:rPr>
-          <w:rFonts w:ascii="Times New Roman" w:hAnsi="Times New Roman" w:cs="Times New Roman"/>
-          <w:sz w:val="28"/>
-          <w:szCs w:val="28"/>
-        </w:rPr>
-        <w:t xml:space="preserve"> scaling, </w:t>
-      </w:r>
-      <w:r>
-        <w:rPr>
-          <w:rFonts w:ascii="Times New Roman" w:hAnsi="Times New Roman" w:cs="Times New Roman"/>
-          <w:sz w:val="28"/>
-          <w:szCs w:val="28"/>
-          <w:lang w:eastAsia="zh-CN"/>
-        </w:rPr>
-        <w:t>and i</w:t>
-      </w:r>
-      <w:r>
-        <w:rPr>
-          <w:rFonts w:ascii="Times New Roman" w:hAnsi="Times New Roman" w:cs="Times New Roman"/>
-          <w:sz w:val="28"/>
-          <w:szCs w:val="28"/>
-        </w:rPr>
-        <w:t xml:space="preserve">mputation]. </w:t>
-      </w:r>
-    </w:p>
-    <w:p>
-      <w:pPr>
-        <w:rPr>
-          <w:rFonts w:ascii="Times New Roman" w:hAnsi="Times New Roman" w:cs="Times New Roman"/>
-          <w:b/>
-          <w:sz w:val="28"/>
-          <w:szCs w:val="28"/>
-        </w:rPr>
-      </w:pPr>
-      <w:r>
-        <w:rPr>
-          <w:rFonts w:ascii="Times New Roman" w:hAnsi="Times New Roman" w:cs="Times New Roman"/>
-          <w:noProof/>
-        </w:rPr>
-        <mc:AlternateContent>
-          <mc:Choice Requires="wps">
-            <w:drawing>
-              <wp:anchor distT="0" distB="0" distL="114300" distR="114300" simplePos="0" relativeHeight="251662336" behindDoc="0" locked="0" layoutInCell="1" hidden="0" allowOverlap="1" wp14:anchorId="29D2881A" wp14:editId="0CBC2869">
-                <wp:simplePos x="0" y="0"/>
-                <wp:positionH relativeFrom="margin">
-                  <wp:align>center</wp:align>
-                </wp:positionH>
-                <wp:positionV relativeFrom="paragraph">
-                  <wp:posOffset>492125</wp:posOffset>
-                </wp:positionV>
-                <wp:extent cx="5800725" cy="2876550"/>
-                <wp:effectExtent l="19050" t="19050" r="28575" b="19050"/>
-                <wp:wrapNone/>
-                <wp:docPr id="1" name="Rectangle 1"/>
-                <wp:cNvGraphicFramePr/>
-                <a:graphic xmlns:a="http://schemas.openxmlformats.org/drawingml/2006/main">
-                  <a:graphicData uri="http://schemas.microsoft.com/office/word/2010/wordprocessingShape">
-                    <wps:wsp>
-                      <wps:cNvSpPr/>
-                      <wps:spPr>
-                        <a:xfrm>
-                          <a:off x="0" y="0"/>
-                          <a:ext cx="5800725" cy="2876550"/>
-                        </a:xfrm>
-                        <a:prstGeom prst="rect">
-                          <a:avLst/>
-                        </a:prstGeom>
-                        <a:solidFill>
-                          <a:schemeClr val="lt1"/>
-                        </a:solidFill>
-                        <a:ln w="28575" cap="flat" cmpd="sng">
-                          <a:solidFill>
-                            <a:schemeClr val="accent1"/>
-                          </a:solidFill>
-                          <a:prstDash val="solid"/>
-                          <a:round/>
-                          <a:headEnd type="none" w="sm" len="sm"/>
-                          <a:tailEnd type="none" w="sm" len="sm"/>
-                        </a:ln>
-                      </wps:spPr>
-                      <wps:txbx>
-                        <w:txbxContent>
-                          <w:p>
-                            <w:pPr>
-                              <w:spacing w:line="258" w:lineRule="auto"/>
-                              <w:textDirection w:val="btLr"/>
-                              <w:rPr>
-                                <w:rFonts w:ascii="Times New Roman" w:hAnsi="Times New Roman" w:cs="Times New Roman"/>
-                              </w:rPr>
-                            </w:pPr>
-                            <w:r>
-                              <w:rPr>
-                                <w:rFonts w:ascii="Times New Roman" w:hAnsi="Times New Roman" w:cs="Times New Roman"/>
-                                <w:b/>
-                                <w:color w:val="156082"/>
-                                <w:sz w:val="32"/>
-                              </w:rPr>
-                              <w:t>Declaration</w:t>
-                            </w:r>
-                          </w:p>
-                          <w:p>
-                            <w:pPr>
-                              <w:spacing w:line="258" w:lineRule="auto"/>
-                              <w:textDirection w:val="btLr"/>
-                              <w:rPr>
-                                <w:rFonts w:ascii="Times New Roman" w:hAnsi="Times New Roman" w:cs="Times New Roman"/>
-                              </w:rPr>
-                            </w:pPr>
-                            <w:r>
-                              <w:rPr>
-                                <w:rFonts w:ascii="Times New Roman" w:hAnsi="Times New Roman" w:cs="Times New Roman"/>
-                                <w:color w:val="000000"/>
-                                <w:sz w:val="28"/>
-                              </w:rPr>
-                              <w:t xml:space="preserve">By submitting this assessment, I confirm that I have read the CCT policy on academic misconduct and understand the implications of submitting work that is not my own or does not appropriately reference material taken from a third party or other source. </w:t>
-                            </w:r>
-                          </w:p>
-                          <w:p>
-                            <w:pPr>
-                              <w:spacing w:line="258" w:lineRule="auto"/>
-                              <w:textDirection w:val="btLr"/>
-                              <w:rPr>
-                                <w:rFonts w:ascii="Times New Roman" w:hAnsi="Times New Roman" w:cs="Times New Roman"/>
-                              </w:rPr>
-                            </w:pPr>
-                            <w:r>
-                              <w:rPr>
-                                <w:rFonts w:ascii="Times New Roman" w:hAnsi="Times New Roman" w:cs="Times New Roman"/>
-                                <w:color w:val="000000"/>
-                                <w:sz w:val="28"/>
-                              </w:rPr>
-                              <w:t>I declare it to be my own work and that all material from third parties has been appropriately referenced.</w:t>
-                            </w:r>
-                          </w:p>
-                          <w:p>
-                            <w:pPr>
-                              <w:spacing w:line="258" w:lineRule="auto"/>
-                              <w:textDirection w:val="btLr"/>
-                              <w:rPr>
-                                <w:rFonts w:ascii="Times New Roman" w:hAnsi="Times New Roman" w:cs="Times New Roman"/>
-                              </w:rPr>
-                            </w:pPr>
-                            <w:r>
-                              <w:rPr>
-                                <w:rFonts w:ascii="Times New Roman" w:hAnsi="Times New Roman" w:cs="Times New Roman"/>
-                                <w:color w:val="000000"/>
-                                <w:sz w:val="28"/>
-                              </w:rPr>
-                              <w:t xml:space="preserve"> I further confirm that this work has not previously been submitted for assessment by myself or someone else in CCT College Dublin or any other higher education institution.</w:t>
-                            </w:r>
-                          </w:p>
-                        </w:txbxContent>
-                      </wps:txbx>
-                      <wps:bodyPr spcFirstLastPara="1" wrap="square" lIns="91425" tIns="45700" rIns="91425" bIns="45700" anchor="t" anchorCtr="0">
-                        <a:noAutofit/>
-                      </wps:bodyPr>
-                    </wps:wsp>
-                  </a:graphicData>
-                </a:graphic>
-              </wp:anchor>
-            </w:drawing>
-          </mc:Choice>
-          <mc:Fallback>
-            <w:pict>
-              <v:rect w14:anchorId="29D2881A" id="Rectangle 1" o:spid="_x0000_s1031" style="position:absolute;margin-left:0;margin-top:38.75pt;width:456.75pt;height:226.5pt;z-index:251662336;visibility:visible;mso-wrap-style:square;mso-wrap-distance-left:9pt;mso-wrap-distance-top:0;mso-wrap-distance-right:9pt;mso-wrap-distance-bottom:0;mso-position-horizontal:center;mso-position-horizontal-relative:margin;mso-position-vertical:absolute;mso-position-vertical-relative:text;v-text-anchor:top" o:gfxdata="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" fillcolor="white [3201]" strokecolor="#4f81bd [3204]" strokeweight="2.25pt">
-                <v:stroke startarrowwidth="narrow" startarrowlength="short" endarrowwidth="narrow" endarrowlength="short" joinstyle="round"/>
-                <v:textbox inset="2.53958mm,1.2694mm,2.53958mm,1.2694mm">
-                  <w:txbxContent>
-                    <w:p>
-                      <w:pPr>
-                        <w:spacing w:line="258" w:lineRule="auto"/>
-                        <w:textDirection w:val="btLr"/>
-                        <w:rPr>
-                          <w:rFonts w:ascii="Times New Roman" w:hAnsi="Times New Roman" w:cs="Times New Roman"/>
-                        </w:rPr>
-                      </w:pPr>
-                      <w:r>
-                        <w:rPr>
-                          <w:rFonts w:ascii="Times New Roman" w:hAnsi="Times New Roman" w:cs="Times New Roman"/>
-                          <w:b/>
-                          <w:color w:val="156082"/>
-                          <w:sz w:val="32"/>
-                        </w:rPr>
-                        <w:t>Declaration</w:t>
-                      </w:r>
-                    </w:p>
-                    <w:p>
-                      <w:pPr>
-                        <w:spacing w:line="258" w:lineRule="auto"/>
-                        <w:textDirection w:val="btLr"/>
-                        <w:rPr>
-                          <w:rFonts w:ascii="Times New Roman" w:hAnsi="Times New Roman" w:cs="Times New Roman"/>
-                        </w:rPr>
-                      </w:pPr>
-                      <w:r>
-                        <w:rPr>
-                          <w:rFonts w:ascii="Times New Roman" w:hAnsi="Times New Roman" w:cs="Times New Roman"/>
-                          <w:color w:val="000000"/>
-                          <w:sz w:val="28"/>
-                        </w:rPr>
-                        <w:t xml:space="preserve">By submitting this assessment, I confirm that I have read the CCT policy on academic misconduct and understand the implications of submitting work that is not my own or does not appropriately reference material taken from a third party or other source. </w:t>
-                      </w:r>
-                    </w:p>
-                    <w:p>
-                      <w:pPr>
-                        <w:spacing w:line="258" w:lineRule="auto"/>
-                        <w:textDirection w:val="btLr"/>
-                        <w:rPr>
-                          <w:rFonts w:ascii="Times New Roman" w:hAnsi="Times New Roman" w:cs="Times New Roman"/>
-                        </w:rPr>
-                      </w:pPr>
-                      <w:r>
-                        <w:rPr>
-                          <w:rFonts w:ascii="Times New Roman" w:hAnsi="Times New Roman" w:cs="Times New Roman"/>
-                          <w:color w:val="000000"/>
-                          <w:sz w:val="28"/>
-                        </w:rPr>
-                        <w:t>I declare it to be my own work and that all material from third parties has been appropriately referenced.</w:t>
-                      </w:r>
-                    </w:p>
-                    <w:p>
-                      <w:pPr>
-                        <w:spacing w:line="258" w:lineRule="auto"/>
-                        <w:textDirection w:val="btLr"/>
-                        <w:rPr>
-                          <w:rFonts w:ascii="Times New Roman" w:hAnsi="Times New Roman" w:cs="Times New Roman"/>
-                        </w:rPr>
-                      </w:pPr>
-                      <w:r>
-                        <w:rPr>
-                          <w:rFonts w:ascii="Times New Roman" w:hAnsi="Times New Roman" w:cs="Times New Roman"/>
-                          <w:color w:val="000000"/>
-                          <w:sz w:val="28"/>
-                        </w:rPr>
-                        <w:t xml:space="preserve"> I further confirm that this work has not previously been submitted for assessment by myself or someone else in CCT College Dublin or any other higher education institution.</w:t>
-                      </w:r>
-                    </w:p>
-                  </w:txbxContent>
-                </v:textbox>
-                <w10:wrap anchorx="margin"/>
-              </v:rect>
-            </w:pict>
-          </mc:Fallback>
-        </mc:AlternateContent>
-      </w:r>
-    </w:p>
-    <w:p>
-      <w:pPr>
-        <w:rPr>
-          <w:rFonts w:ascii="Times New Roman" w:hAnsi="Times New Roman" w:cs="Times New Roman"/>
-        </w:rPr>
-      </w:pPr>
-    </w:p>
-    <w:p>
-      <w:pPr>
-        <w:rPr>
-          <w:rFonts w:ascii="Times New Roman" w:hAnsi="Times New Roman" w:cs="Times New Roman"/>
-        </w:rPr>
-      </w:pPr>
-    </w:p>
-    <w:p>
-      <w:pPr>
-        <w:rPr>
-          <w:rFonts w:ascii="Times New Roman" w:hAnsi="Times New Roman" w:cs="Times New Roman"/>
-        </w:rPr>
-      </w:pPr>
-    </w:p>
-    <w:p>
-      <w:pPr>
-        <w:rPr>
-          <w:rFonts w:ascii="Times New Roman" w:hAnsi="Times New Roman" w:cs="Times New Roman"/>
-        </w:rPr>
-        <w:sectPr>
-          <w:footerReference w:type="default" r:id="rId17"/>
-          <w:pgSz w:w="11906" w:h="16838"/>
-          <w:pgMar w:top="1440" w:right="1440" w:bottom="1440" w:left="1440" w:header="708" w:footer="708" w:gutter="0"/>
-          <w:pgNumType w:start="1"/>
-          <w:cols w:space="720"/>
-        </w:sectPr>
-      </w:pPr>
-    </w:p>
-    <w:p>
-      <w:pPr>
-        <w:rPr>
-          <w:rFonts w:ascii="Times New Roman" w:hAnsi="Times New Roman" w:cs="Times New Roman"/>
-        </w:rPr>
-      </w:pPr>
-    </w:p>
-    <w:p>
-      <w:pPr>
-        <w:rPr>
-          <w:rFonts w:ascii="Times New Roman" w:hAnsi="Times New Roman" w:cs="Times New Roman"/>
-          <w:color w:val="FF0000"/>
-        </w:rPr>
-      </w:pPr>
-    </w:p>
-    <w:tbl>
-      <w:tblPr>
-        <w:tblStyle w:val="TableGrid"/>
-        <w:tblW w:w="11057" w:type="dxa"/>
-        <w:tblInd w:w="-1139" w:type="dxa"/>
-        <w:tblLook w:val="04A0" w:firstRow="1" w:lastRow="0" w:firstColumn="1" w:lastColumn="0" w:noHBand="0" w:noVBand="1"/>
-      </w:tblPr>
-      <w:tblGrid>
-        <w:gridCol w:w="1701"/>
-        <w:gridCol w:w="2977"/>
-        <w:gridCol w:w="2126"/>
-        <w:gridCol w:w="4253"/>
-      </w:tblGrid>
-      <w:tr>
-        <w:trPr>
-          <w:trHeight w:val="430"/>
-        </w:trPr>
-        <w:tc>
-          <w:tcPr>
-            <w:tcW w:w="1701" w:type="dxa"/>
-            <w:vAlign w:val="center"/>
-          </w:tcPr>
-          <w:p>
-            <w:pPr>
-              <w:spacing w:line="276" w:lineRule="auto"/>
-              <w:rPr>
-                <w:rFonts w:ascii="Times New Roman" w:hAnsi="Times New Roman" w:cs="Times New Roman"/>
-                <w:i/>
-                <w:iCs/>
-                <w:sz w:val="20"/>
-                <w:szCs w:val="20"/>
-                <w:highlight w:val="yellow"/>
-              </w:rPr>
-            </w:pPr>
-            <w:r>
-              <w:rPr>
-                <w:rFonts w:ascii="Times New Roman" w:hAnsi="Times New Roman" w:cs="Times New Roman"/>
-                <w:b/>
-                <w:bCs/>
-                <w:sz w:val="20"/>
-                <w:szCs w:val="20"/>
-              </w:rPr>
-              <w:t>AI competence</w:t>
-            </w:r>
-          </w:p>
-        </w:tc>
-        <w:tc>
-          <w:tcPr>
-            <w:tcW w:w="2977" w:type="dxa"/>
-            <w:vAlign w:val="center"/>
-          </w:tcPr>
-          <w:p>
-            <w:pPr>
-              <w:spacing w:line="276" w:lineRule="auto"/>
-              <w:rPr>
-                <w:rFonts w:ascii="Times New Roman" w:hAnsi="Times New Roman" w:cs="Times New Roman"/>
-                <w:i/>
-                <w:iCs/>
-                <w:sz w:val="20"/>
-                <w:szCs w:val="20"/>
-                <w:highlight w:val="yellow"/>
-              </w:rPr>
-            </w:pPr>
-            <w:r>
-              <w:rPr>
-                <w:rFonts w:ascii="Times New Roman" w:hAnsi="Times New Roman" w:cs="Times New Roman"/>
-                <w:b/>
-                <w:bCs/>
-                <w:sz w:val="20"/>
-                <w:szCs w:val="20"/>
-              </w:rPr>
-              <w:t>Reflective prompts (to students)</w:t>
-            </w:r>
-          </w:p>
-        </w:tc>
-        <w:tc>
-          <w:tcPr>
-            <w:tcW w:w="2126" w:type="dxa"/>
-            <w:vAlign w:val="center"/>
-          </w:tcPr>
-          <w:p>
-            <w:pPr>
-              <w:spacing w:line="276" w:lineRule="auto"/>
-              <w:rPr>
-                <w:rFonts w:ascii="Times New Roman" w:hAnsi="Times New Roman" w:cs="Times New Roman"/>
-                <w:i/>
-                <w:iCs/>
-                <w:sz w:val="20"/>
-                <w:szCs w:val="20"/>
-                <w:highlight w:val="yellow"/>
-              </w:rPr>
-            </w:pPr>
-            <w:r>
-              <w:rPr>
-                <w:rFonts w:ascii="Times New Roman" w:hAnsi="Times New Roman" w:cs="Times New Roman"/>
-                <w:b/>
-                <w:bCs/>
-                <w:sz w:val="20"/>
-                <w:szCs w:val="20"/>
-              </w:rPr>
-              <w:t>Lecturer expectations</w:t>
-            </w:r>
-          </w:p>
-        </w:tc>
-        <w:tc>
-          <w:tcPr>
-            <w:tcW w:w="4253" w:type="dxa"/>
-            <w:vAlign w:val="center"/>
-          </w:tcPr>
-          <w:p>
-            <w:pPr>
-              <w:spacing w:line="276" w:lineRule="auto"/>
-              <w:rPr>
-                <w:rFonts w:ascii="Times New Roman" w:hAnsi="Times New Roman" w:cs="Times New Roman"/>
-                <w:i/>
-                <w:iCs/>
-                <w:sz w:val="20"/>
-                <w:szCs w:val="20"/>
-                <w:highlight w:val="yellow"/>
-              </w:rPr>
-            </w:pPr>
-            <w:r>
-              <w:rPr>
-                <w:rFonts w:ascii="Times New Roman" w:hAnsi="Times New Roman" w:cs="Times New Roman"/>
-                <w:b/>
-                <w:bCs/>
-                <w:sz w:val="20"/>
-                <w:szCs w:val="20"/>
-              </w:rPr>
-              <w:t>Student response</w:t>
-            </w:r>
-          </w:p>
-        </w:tc>
-      </w:tr>
-      <w:tr>
-        <w:tc>
-          <w:tcPr>
-            <w:tcW w:w="1701" w:type="dxa"/>
-          </w:tcPr>
-          <w:p>
-            <w:pPr>
-              <w:spacing w:line="276" w:lineRule="auto"/>
-              <w:rPr>
-                <w:rFonts w:ascii="Times New Roman" w:hAnsi="Times New Roman" w:cs="Times New Roman"/>
-                <w:b/>
-                <w:bCs/>
-                <w:sz w:val="20"/>
-                <w:szCs w:val="20"/>
-              </w:rPr>
-            </w:pPr>
-          </w:p>
-          <w:p>
-            <w:pPr>
-              <w:spacing w:line="276" w:lineRule="auto"/>
-              <w:rPr>
-                <w:rFonts w:ascii="Times New Roman" w:hAnsi="Times New Roman" w:cs="Times New Roman"/>
-                <w:b/>
-                <w:bCs/>
-                <w:sz w:val="20"/>
-                <w:szCs w:val="20"/>
-              </w:rPr>
-            </w:pPr>
-          </w:p>
-          <w:p>
-            <w:pPr>
-              <w:spacing w:line="276" w:lineRule="auto"/>
-              <w:rPr>
-                <w:rFonts w:ascii="Times New Roman" w:hAnsi="Times New Roman" w:cs="Times New Roman"/>
-                <w:b/>
-                <w:bCs/>
-                <w:sz w:val="20"/>
-                <w:szCs w:val="20"/>
-              </w:rPr>
-            </w:pPr>
-          </w:p>
-          <w:p>
-            <w:pPr>
-              <w:spacing w:line="276" w:lineRule="auto"/>
-              <w:rPr>
-                <w:rFonts w:ascii="Times New Roman" w:hAnsi="Times New Roman" w:cs="Times New Roman"/>
-                <w:b/>
-                <w:bCs/>
-                <w:sz w:val="20"/>
-                <w:szCs w:val="20"/>
-              </w:rPr>
-            </w:pPr>
-          </w:p>
-          <w:p>
-            <w:pPr>
-              <w:spacing w:line="276" w:lineRule="auto"/>
-              <w:rPr>
-                <w:rFonts w:ascii="Times New Roman" w:hAnsi="Times New Roman" w:cs="Times New Roman"/>
-                <w:b/>
-                <w:bCs/>
-                <w:sz w:val="20"/>
-                <w:szCs w:val="20"/>
-              </w:rPr>
-            </w:pPr>
-          </w:p>
-          <w:p>
-            <w:pPr>
-              <w:spacing w:line="276" w:lineRule="auto"/>
-              <w:rPr>
-                <w:rFonts w:ascii="Times New Roman" w:hAnsi="Times New Roman" w:cs="Times New Roman"/>
-                <w:sz w:val="20"/>
-                <w:szCs w:val="20"/>
-              </w:rPr>
-            </w:pPr>
-            <w:r>
-              <w:rPr>
-                <w:rFonts w:ascii="Times New Roman" w:hAnsi="Times New Roman" w:cs="Times New Roman"/>
-                <w:b/>
-                <w:bCs/>
-                <w:sz w:val="20"/>
-                <w:szCs w:val="20"/>
-              </w:rPr>
-              <w:t>Delegation</w:t>
-            </w:r>
-          </w:p>
-          <w:p>
-            <w:pPr>
-              <w:spacing w:line="276" w:lineRule="auto"/>
-              <w:rPr>
-                <w:rFonts w:ascii="Times New Roman" w:hAnsi="Times New Roman" w:cs="Times New Roman"/>
-                <w:i/>
-                <w:iCs/>
-                <w:sz w:val="20"/>
-                <w:szCs w:val="20"/>
-              </w:rPr>
-            </w:pPr>
-            <w:r>
-              <w:rPr>
-                <w:rFonts w:ascii="Times New Roman" w:hAnsi="Times New Roman" w:cs="Times New Roman"/>
-                <w:i/>
-                <w:iCs/>
-                <w:sz w:val="20"/>
-                <w:szCs w:val="20"/>
-              </w:rPr>
-              <w:t>Deciding whether &amp; when to use AI</w:t>
-            </w:r>
-          </w:p>
-        </w:tc>
-        <w:tc>
-          <w:tcPr>
-            <w:tcW w:w="2977" w:type="dxa"/>
-          </w:tcPr>
-          <w:p>
-            <w:pPr>
-              <w:spacing w:line="276" w:lineRule="auto"/>
-              <w:rPr>
-                <w:rFonts w:ascii="Times New Roman" w:hAnsi="Times New Roman" w:cs="Times New Roman"/>
-                <w:sz w:val="20"/>
-                <w:szCs w:val="20"/>
-              </w:rPr>
-            </w:pPr>
-          </w:p>
-          <w:p>
-            <w:pPr>
-              <w:spacing w:line="276" w:lineRule="auto"/>
-              <w:rPr>
-                <w:rFonts w:ascii="Times New Roman" w:hAnsi="Times New Roman" w:cs="Times New Roman"/>
-                <w:sz w:val="20"/>
-                <w:szCs w:val="20"/>
-              </w:rPr>
-            </w:pPr>
-          </w:p>
-          <w:p>
-            <w:pPr>
-              <w:spacing w:line="276" w:lineRule="auto"/>
-              <w:rPr>
-                <w:rFonts w:ascii="Times New Roman" w:hAnsi="Times New Roman" w:cs="Times New Roman"/>
-                <w:sz w:val="20"/>
-                <w:szCs w:val="20"/>
-              </w:rPr>
-            </w:pPr>
-          </w:p>
-          <w:p>
-            <w:pPr>
-              <w:spacing w:line="276" w:lineRule="auto"/>
-              <w:rPr>
-                <w:rFonts w:ascii="Times New Roman" w:hAnsi="Times New Roman" w:cs="Times New Roman"/>
-                <w:i/>
-                <w:iCs/>
-                <w:sz w:val="20"/>
-                <w:szCs w:val="20"/>
-              </w:rPr>
-            </w:pPr>
-            <w:r>
-              <w:rPr>
-                <w:rFonts w:ascii="Times New Roman" w:hAnsi="Times New Roman" w:cs="Times New Roman"/>
-                <w:sz w:val="20"/>
-                <w:szCs w:val="20"/>
-              </w:rPr>
-              <w:t>Identify the specific tasks in this assessment where you chose to use AI, and explain your reasoning. Where did AI add value? Where did you decide not to use it, and why?</w:t>
-            </w:r>
-          </w:p>
-        </w:tc>
-        <w:tc>
-          <w:tcPr>
-            <w:tcW w:w="2126" w:type="dxa"/>
-          </w:tcPr>
-          <w:p>
-            <w:pPr>
-              <w:spacing w:line="276" w:lineRule="auto"/>
-              <w:rPr>
-                <w:rFonts w:ascii="Times New Roman" w:hAnsi="Times New Roman" w:cs="Times New Roman"/>
-                <w:b/>
-                <w:bCs/>
-                <w:sz w:val="20"/>
-                <w:szCs w:val="20"/>
-              </w:rPr>
-            </w:pPr>
-          </w:p>
-          <w:p>
-            <w:pPr>
-              <w:spacing w:line="276" w:lineRule="auto"/>
-              <w:rPr>
-                <w:rFonts w:ascii="Times New Roman" w:hAnsi="Times New Roman" w:cs="Times New Roman"/>
-                <w:sz w:val="20"/>
-                <w:szCs w:val="20"/>
-              </w:rPr>
-            </w:pPr>
-            <w:r>
-              <w:rPr>
-                <w:rFonts w:ascii="Times New Roman" w:hAnsi="Times New Roman" w:cs="Times New Roman"/>
-                <w:sz w:val="20"/>
-                <w:szCs w:val="20"/>
-              </w:rPr>
-              <w:t>You may use AI to support your learning and development of the application. Clearly identify where you used AI and where you completed the work independently.</w:t>
-            </w:r>
-          </w:p>
-          <w:p>
-            <w:pPr>
-              <w:spacing w:line="276" w:lineRule="auto"/>
-              <w:rPr>
-                <w:rFonts w:ascii="Times New Roman" w:hAnsi="Times New Roman" w:cs="Times New Roman"/>
-                <w:b/>
-                <w:bCs/>
-                <w:sz w:val="20"/>
-                <w:szCs w:val="20"/>
-              </w:rPr>
-            </w:pPr>
-          </w:p>
-          <w:p>
-            <w:pPr>
-              <w:spacing w:line="276" w:lineRule="auto"/>
-              <w:rPr>
-                <w:rFonts w:ascii="Times New Roman" w:hAnsi="Times New Roman" w:cs="Times New Roman"/>
-                <w:b/>
-                <w:bCs/>
-                <w:sz w:val="20"/>
-                <w:szCs w:val="20"/>
-              </w:rPr>
-            </w:pPr>
-          </w:p>
-          <w:p>
-            <w:pPr>
-              <w:pStyle w:val="ListParagraph"/>
-              <w:numPr>
-                <w:ilvl w:val="0"/>
-                <w:numId w:val="10"/>
-              </w:numPr>
-              <w:spacing w:line="276" w:lineRule="auto"/>
-              <w:ind w:left="403"/>
-              <w:rPr>
-                <w:rFonts w:ascii="Times New Roman" w:hAnsi="Times New Roman" w:cs="Times New Roman"/>
-                <w:b/>
-                <w:bCs/>
-                <w:sz w:val="20"/>
-                <w:szCs w:val="20"/>
-              </w:rPr>
-            </w:pPr>
-          </w:p>
-        </w:tc>
-        <w:tc>
-          <w:tcPr>
-            <w:tcW w:w="4253" w:type="dxa"/>
-          </w:tcPr>
-          <w:p>
-            <w:pPr>
-              <w:spacing w:line="276" w:lineRule="auto"/>
-              <w:rPr>
-                <w:rFonts w:ascii="Times New Roman" w:hAnsi="Times New Roman" w:cs="Times New Roman"/>
-                <w:sz w:val="20"/>
-                <w:szCs w:val="20"/>
-              </w:rPr>
-            </w:pPr>
-          </w:p>
-          <w:p>
-            <w:pPr>
-              <w:spacing w:line="276" w:lineRule="auto"/>
-              <w:rPr>
-                <w:rFonts w:ascii="Times New Roman" w:hAnsi="Times New Roman" w:cs="Times New Roman"/>
-                <w:sz w:val="20"/>
-                <w:szCs w:val="20"/>
-              </w:rPr>
-            </w:pPr>
-            <w:r>
-              <w:rPr>
-                <w:rFonts w:ascii="Times New Roman" w:hAnsi="Times New Roman" w:cs="Times New Roman"/>
-                <w:sz w:val="20"/>
-                <w:szCs w:val="20"/>
-              </w:rPr>
-              <w:t>Briefly state which parts of your application assessment you used AI for and why.</w:t>
-            </w:r>
-          </w:p>
-          <w:p>
-            <w:pPr>
-              <w:spacing w:line="276" w:lineRule="auto"/>
-              <w:rPr>
-                <w:rFonts w:ascii="Times New Roman" w:hAnsi="Times New Roman" w:cs="Times New Roman"/>
-                <w:sz w:val="20"/>
-                <w:szCs w:val="20"/>
-              </w:rPr>
-            </w:pPr>
-          </w:p>
-          <w:p>
-            <w:pPr>
-              <w:spacing w:line="276" w:lineRule="auto"/>
-              <w:rPr>
-                <w:rFonts w:ascii="Times New Roman" w:hAnsi="Times New Roman" w:cs="Times New Roman"/>
-                <w:sz w:val="20"/>
-                <w:szCs w:val="20"/>
-                <w:lang w:eastAsia="zh-CN"/>
-              </w:rPr>
-            </w:pPr>
-            <w:r>
-              <w:rPr>
-                <w:rFonts w:ascii="Times New Roman" w:hAnsi="Times New Roman" w:cs="Times New Roman"/>
-                <w:sz w:val="20"/>
-                <w:szCs w:val="20"/>
-                <w:lang w:eastAsia="zh-CN"/>
-              </w:rPr>
-              <w:t xml:space="preserve">1. In part </w:t>
-            </w:r>
-            <w:r>
-              <w:rPr>
-                <w:rFonts w:ascii="Times New Roman" w:hAnsi="Times New Roman" w:cs="Times New Roman"/>
-                <w:sz w:val="20"/>
-                <w:szCs w:val="20"/>
-                <w:lang w:eastAsia="zh-CN"/>
-              </w:rPr>
-              <w:t>7 (Data Source)</w:t>
-            </w:r>
-            <w:r>
-              <w:rPr>
-                <w:rFonts w:ascii="Times New Roman" w:hAnsi="Times New Roman" w:cs="Times New Roman"/>
-                <w:sz w:val="20"/>
-                <w:szCs w:val="20"/>
-                <w:lang w:eastAsia="zh-CN"/>
-              </w:rPr>
-              <w:t xml:space="preserve">, </w:t>
-            </w:r>
-            <w:r>
-              <w:rPr>
-                <w:rFonts w:ascii="Times New Roman" w:hAnsi="Times New Roman" w:cs="Times New Roman"/>
-                <w:sz w:val="20"/>
-                <w:szCs w:val="20"/>
-                <w:lang w:eastAsia="zh-CN"/>
-              </w:rPr>
-              <w:t>in</w:t>
-            </w:r>
-            <w:r>
-              <w:rPr>
-                <w:rFonts w:ascii="Times New Roman" w:hAnsi="Times New Roman" w:cs="Times New Roman"/>
-                <w:sz w:val="20"/>
-                <w:szCs w:val="20"/>
-                <w:lang w:eastAsia="zh-CN"/>
-              </w:rPr>
-              <w:t xml:space="preserve"> order to transform a real-time operational dataset into something I can work on for this project, I used AI to generate an authentic dataset (1000 rows,11 columns) based on the original dataset</w:t>
-            </w:r>
-            <w:r>
-              <w:rPr>
-                <w:rFonts w:ascii="Times New Roman" w:hAnsi="Times New Roman" w:cs="Times New Roman"/>
-                <w:sz w:val="20"/>
-                <w:szCs w:val="20"/>
-                <w:lang w:eastAsia="zh-CN"/>
-              </w:rPr>
-              <w:t xml:space="preserve"> </w:t>
-            </w:r>
-            <w:r>
-              <w:rPr>
-                <w:rFonts w:ascii="Times New Roman" w:hAnsi="Times New Roman" w:cs="Times New Roman"/>
-                <w:sz w:val="20"/>
-                <w:szCs w:val="20"/>
-                <w:lang w:eastAsia="zh-CN"/>
-              </w:rPr>
-              <w:t>(84 rows,11 columns) using data masking and scaling.</w:t>
-            </w:r>
-          </w:p>
-          <w:p>
-            <w:pPr>
-              <w:spacing w:line="276" w:lineRule="auto"/>
-              <w:rPr>
-                <w:rFonts w:ascii="Times New Roman" w:hAnsi="Times New Roman" w:cs="Times New Roman"/>
-                <w:sz w:val="20"/>
-                <w:szCs w:val="20"/>
-                <w:lang w:eastAsia="zh-CN"/>
-              </w:rPr>
-            </w:pPr>
-          </w:p>
-          <w:p>
-            <w:pPr>
-              <w:spacing w:line="276" w:lineRule="auto"/>
-              <w:rPr>
-                <w:rFonts w:ascii="Times New Roman" w:hAnsi="Times New Roman" w:cs="Times New Roman"/>
-                <w:sz w:val="20"/>
-                <w:szCs w:val="20"/>
-                <w:lang w:eastAsia="zh-CN"/>
-              </w:rPr>
-            </w:pPr>
-            <w:r>
-              <w:rPr>
-                <w:rFonts w:ascii="Times New Roman" w:hAnsi="Times New Roman" w:cs="Times New Roman"/>
-                <w:sz w:val="20"/>
-                <w:szCs w:val="20"/>
-                <w:lang w:eastAsia="zh-CN"/>
-              </w:rPr>
-              <w:t>2. In the part of 7.Data Source, I use AI for solving a visualization issue with plotting the Poisson distribution for VIP tickets, as the 501 overlapping labels, turning your x-axis into a solid black bar,I need to get a better and clearer visualization.</w:t>
-            </w:r>
-          </w:p>
-        </w:tc>
-      </w:tr>
-      <w:tr>
-        <w:tc>
-          <w:tcPr>
-            <w:tcW w:w="1701" w:type="dxa"/>
-          </w:tcPr>
-          <w:p>
-            <w:pPr>
-              <w:spacing w:line="276" w:lineRule="auto"/>
-              <w:rPr>
-                <w:rFonts w:ascii="Times New Roman" w:hAnsi="Times New Roman" w:cs="Times New Roman"/>
-                <w:b/>
-                <w:bCs/>
-                <w:sz w:val="20"/>
-                <w:szCs w:val="20"/>
-              </w:rPr>
-            </w:pPr>
-          </w:p>
-          <w:p>
-            <w:pPr>
-              <w:spacing w:line="276" w:lineRule="auto"/>
-              <w:rPr>
-                <w:rFonts w:ascii="Times New Roman" w:hAnsi="Times New Roman" w:cs="Times New Roman"/>
-                <w:b/>
-                <w:bCs/>
-                <w:sz w:val="20"/>
-                <w:szCs w:val="20"/>
-              </w:rPr>
-            </w:pPr>
-          </w:p>
-          <w:p>
-            <w:pPr>
-              <w:spacing w:line="276" w:lineRule="auto"/>
-              <w:rPr>
-                <w:rFonts w:ascii="Times New Roman" w:hAnsi="Times New Roman" w:cs="Times New Roman"/>
-                <w:b/>
-                <w:bCs/>
-                <w:sz w:val="20"/>
-                <w:szCs w:val="20"/>
-              </w:rPr>
-            </w:pPr>
-          </w:p>
-          <w:p>
-            <w:pPr>
-              <w:spacing w:line="276" w:lineRule="auto"/>
-              <w:rPr>
-                <w:rFonts w:ascii="Times New Roman" w:hAnsi="Times New Roman" w:cs="Times New Roman"/>
-                <w:b/>
-                <w:bCs/>
-                <w:sz w:val="20"/>
-                <w:szCs w:val="20"/>
-              </w:rPr>
-            </w:pPr>
-          </w:p>
-          <w:p>
-            <w:pPr>
-              <w:spacing w:line="276" w:lineRule="auto"/>
-              <w:rPr>
-                <w:rFonts w:ascii="Times New Roman" w:hAnsi="Times New Roman" w:cs="Times New Roman"/>
-                <w:b/>
-                <w:bCs/>
-                <w:sz w:val="20"/>
-                <w:szCs w:val="20"/>
-              </w:rPr>
-            </w:pPr>
-          </w:p>
-          <w:p>
-            <w:pPr>
-              <w:spacing w:line="276" w:lineRule="auto"/>
-              <w:rPr>
-                <w:rFonts w:ascii="Times New Roman" w:hAnsi="Times New Roman" w:cs="Times New Roman"/>
-                <w:b/>
-                <w:bCs/>
-                <w:sz w:val="20"/>
-                <w:szCs w:val="20"/>
-              </w:rPr>
-            </w:pPr>
-          </w:p>
-          <w:p>
-            <w:pPr>
-              <w:spacing w:line="276" w:lineRule="auto"/>
-              <w:rPr>
-                <w:rFonts w:ascii="Times New Roman" w:hAnsi="Times New Roman" w:cs="Times New Roman"/>
-                <w:sz w:val="20"/>
-                <w:szCs w:val="20"/>
-              </w:rPr>
-            </w:pPr>
-            <w:r>
-              <w:rPr>
-                <w:rFonts w:ascii="Times New Roman" w:hAnsi="Times New Roman" w:cs="Times New Roman"/>
-                <w:b/>
-                <w:bCs/>
-                <w:sz w:val="20"/>
-                <w:szCs w:val="20"/>
-              </w:rPr>
-              <w:t>Description</w:t>
-            </w:r>
-          </w:p>
-          <w:p>
-            <w:pPr>
-              <w:spacing w:line="276" w:lineRule="auto"/>
-              <w:rPr>
-                <w:rFonts w:ascii="Times New Roman" w:hAnsi="Times New Roman" w:cs="Times New Roman"/>
-                <w:i/>
-                <w:iCs/>
-                <w:sz w:val="20"/>
-                <w:szCs w:val="20"/>
-              </w:rPr>
-            </w:pPr>
-            <w:r>
-              <w:rPr>
-                <w:rFonts w:ascii="Times New Roman" w:hAnsi="Times New Roman" w:cs="Times New Roman"/>
-                <w:i/>
-                <w:iCs/>
-                <w:sz w:val="20"/>
-                <w:szCs w:val="20"/>
-              </w:rPr>
-              <w:t>How you prompted the AI</w:t>
-            </w:r>
-          </w:p>
-        </w:tc>
-        <w:tc>
-          <w:tcPr>
-            <w:tcW w:w="2977" w:type="dxa"/>
-          </w:tcPr>
-          <w:p>
-            <w:pPr>
-              <w:spacing w:line="276" w:lineRule="auto"/>
-              <w:rPr>
-                <w:rFonts w:ascii="Times New Roman" w:hAnsi="Times New Roman" w:cs="Times New Roman"/>
-                <w:sz w:val="20"/>
-                <w:szCs w:val="20"/>
-              </w:rPr>
-            </w:pPr>
-          </w:p>
-          <w:p>
-            <w:pPr>
-              <w:spacing w:line="276" w:lineRule="auto"/>
-              <w:rPr>
-                <w:rFonts w:ascii="Times New Roman" w:hAnsi="Times New Roman" w:cs="Times New Roman"/>
-                <w:sz w:val="20"/>
-                <w:szCs w:val="20"/>
-              </w:rPr>
-            </w:pPr>
-          </w:p>
-          <w:p>
-            <w:pPr>
-              <w:spacing w:line="276" w:lineRule="auto"/>
-              <w:rPr>
-                <w:rFonts w:ascii="Times New Roman" w:hAnsi="Times New Roman" w:cs="Times New Roman"/>
-                <w:sz w:val="20"/>
-                <w:szCs w:val="20"/>
-              </w:rPr>
-            </w:pPr>
-          </w:p>
-          <w:p>
-            <w:pPr>
-              <w:spacing w:line="276" w:lineRule="auto"/>
-              <w:rPr>
-                <w:rFonts w:ascii="Times New Roman" w:hAnsi="Times New Roman" w:cs="Times New Roman"/>
-                <w:sz w:val="20"/>
-                <w:szCs w:val="20"/>
-              </w:rPr>
-            </w:pPr>
-          </w:p>
-          <w:p>
-            <w:pPr>
-              <w:spacing w:line="276" w:lineRule="auto"/>
-              <w:rPr>
-                <w:rFonts w:ascii="Times New Roman" w:hAnsi="Times New Roman" w:cs="Times New Roman"/>
-                <w:sz w:val="20"/>
-                <w:szCs w:val="20"/>
-              </w:rPr>
-            </w:pPr>
-          </w:p>
-          <w:p>
-            <w:pPr>
-              <w:spacing w:line="276" w:lineRule="auto"/>
-              <w:rPr>
-                <w:rFonts w:ascii="Times New Roman" w:hAnsi="Times New Roman" w:cs="Times New Roman"/>
-                <w:i/>
-                <w:iCs/>
-                <w:sz w:val="20"/>
-                <w:szCs w:val="20"/>
-              </w:rPr>
-            </w:pPr>
-            <w:r>
-              <w:rPr>
-                <w:rFonts w:ascii="Times New Roman" w:hAnsi="Times New Roman" w:cs="Times New Roman"/>
-                <w:sz w:val="20"/>
-                <w:szCs w:val="20"/>
-              </w:rPr>
-              <w:t>Include the exact prompts you used in your appendix (recorded on the AI Tools declaration). Reflect on how you communicated your goals to the AI — did you need to iterate or refine your prompts to get useful output?</w:t>
-            </w:r>
-          </w:p>
-        </w:tc>
-        <w:tc>
-          <w:tcPr>
-            <w:tcW w:w="2126" w:type="dxa"/>
-          </w:tcPr>
-          <w:p>
-            <w:pPr>
-              <w:spacing w:line="276" w:lineRule="auto"/>
-              <w:rPr>
-                <w:rFonts w:ascii="Times New Roman" w:hAnsi="Times New Roman" w:cs="Times New Roman"/>
-                <w:sz w:val="20"/>
-                <w:szCs w:val="20"/>
-              </w:rPr>
-            </w:pPr>
-          </w:p>
-          <w:p>
-            <w:pPr>
-              <w:spacing w:line="276" w:lineRule="auto"/>
-              <w:rPr>
-                <w:rFonts w:ascii="Times New Roman" w:hAnsi="Times New Roman" w:cs="Times New Roman"/>
-                <w:sz w:val="20"/>
-                <w:szCs w:val="20"/>
-              </w:rPr>
-            </w:pPr>
-          </w:p>
-          <w:p>
-            <w:pPr>
-              <w:spacing w:line="276" w:lineRule="auto"/>
-              <w:rPr>
-                <w:rFonts w:ascii="Times New Roman" w:hAnsi="Times New Roman" w:cs="Times New Roman"/>
-                <w:sz w:val="20"/>
-                <w:szCs w:val="20"/>
-              </w:rPr>
-            </w:pPr>
-          </w:p>
-          <w:p>
-            <w:pPr>
-              <w:spacing w:line="276" w:lineRule="auto"/>
-              <w:rPr>
-                <w:rFonts w:ascii="Times New Roman" w:hAnsi="Times New Roman" w:cs="Times New Roman"/>
-                <w:sz w:val="20"/>
-                <w:szCs w:val="20"/>
-              </w:rPr>
-            </w:pPr>
-          </w:p>
-          <w:p>
-            <w:pPr>
-              <w:spacing w:line="276" w:lineRule="auto"/>
-              <w:rPr>
-                <w:rFonts w:ascii="Times New Roman" w:hAnsi="Times New Roman" w:cs="Times New Roman"/>
-                <w:sz w:val="20"/>
-                <w:szCs w:val="20"/>
-              </w:rPr>
-            </w:pPr>
-          </w:p>
-          <w:p>
-            <w:pPr>
-              <w:spacing w:line="276" w:lineRule="auto"/>
-              <w:rPr>
-                <w:rFonts w:ascii="Times New Roman" w:hAnsi="Times New Roman" w:cs="Times New Roman"/>
-                <w:sz w:val="20"/>
-                <w:szCs w:val="20"/>
-              </w:rPr>
-            </w:pPr>
-            <w:r>
-              <w:rPr>
-                <w:rFonts w:ascii="Times New Roman" w:hAnsi="Times New Roman" w:cs="Times New Roman"/>
-                <w:sz w:val="20"/>
-                <w:szCs w:val="20"/>
-              </w:rPr>
-              <w:t>You must provide the exact prompts and relevant AI outputs used during the development of your application.</w:t>
-            </w:r>
-          </w:p>
-          <w:p>
-            <w:pPr>
-              <w:spacing w:line="276" w:lineRule="auto"/>
-              <w:rPr>
-                <w:rFonts w:ascii="Times New Roman" w:hAnsi="Times New Roman" w:cs="Times New Roman"/>
-                <w:sz w:val="20"/>
-                <w:szCs w:val="20"/>
-              </w:rPr>
-            </w:pPr>
-          </w:p>
-          <w:p>
-            <w:pPr>
-              <w:spacing w:line="276" w:lineRule="auto"/>
-              <w:rPr>
-                <w:rFonts w:ascii="Times New Roman" w:hAnsi="Times New Roman" w:cs="Times New Roman"/>
-                <w:sz w:val="20"/>
-                <w:szCs w:val="20"/>
-              </w:rPr>
-            </w:pPr>
-          </w:p>
-          <w:p>
-            <w:pPr>
-              <w:spacing w:line="276" w:lineRule="auto"/>
-              <w:rPr>
-                <w:rFonts w:ascii="Times New Roman" w:hAnsi="Times New Roman" w:cs="Times New Roman"/>
-                <w:sz w:val="20"/>
-                <w:szCs w:val="20"/>
-              </w:rPr>
-            </w:pPr>
-          </w:p>
-          <w:p>
-            <w:pPr>
-              <w:spacing w:line="276" w:lineRule="auto"/>
-              <w:rPr>
-                <w:rFonts w:ascii="Times New Roman" w:hAnsi="Times New Roman" w:cs="Times New Roman"/>
-                <w:sz w:val="20"/>
-                <w:szCs w:val="20"/>
-              </w:rPr>
-            </w:pPr>
-          </w:p>
-        </w:tc>
-        <w:tc>
-          <w:tcPr>
-            <w:tcW w:w="4253" w:type="dxa"/>
-          </w:tcPr>
-          <w:p>
-            <w:pPr>
-              <w:spacing w:line="276" w:lineRule="auto"/>
-              <w:rPr>
-                <w:rFonts w:ascii="Times New Roman" w:hAnsi="Times New Roman" w:cs="Times New Roman"/>
-                <w:sz w:val="20"/>
-                <w:szCs w:val="20"/>
-              </w:rPr>
-            </w:pPr>
-          </w:p>
-          <w:p>
-            <w:pPr>
-              <w:spacing w:line="276" w:lineRule="auto"/>
-              <w:rPr>
-                <w:rFonts w:ascii="Times New Roman" w:hAnsi="Times New Roman" w:cs="Times New Roman"/>
-                <w:sz w:val="20"/>
-                <w:szCs w:val="20"/>
-              </w:rPr>
-            </w:pPr>
-            <w:r>
-              <w:rPr>
-                <w:rFonts w:ascii="Times New Roman" w:hAnsi="Times New Roman" w:cs="Times New Roman"/>
-                <w:sz w:val="20"/>
-                <w:szCs w:val="20"/>
-              </w:rPr>
-              <w:t>Include the exact AI prompts and outputs in your submitted AI-use Word document.</w:t>
-            </w:r>
-          </w:p>
-          <w:p>
-            <w:pPr>
-              <w:spacing w:line="276" w:lineRule="auto"/>
-              <w:rPr>
-                <w:rFonts w:ascii="Times New Roman" w:hAnsi="Times New Roman" w:cs="Times New Roman"/>
-                <w:sz w:val="20"/>
-                <w:szCs w:val="20"/>
-              </w:rPr>
-            </w:pPr>
-          </w:p>
-          <w:p>
-            <w:pPr>
-              <w:spacing w:line="276" w:lineRule="auto"/>
-              <w:rPr>
-                <w:rFonts w:ascii="Times New Roman" w:hAnsi="Times New Roman" w:cs="Times New Roman"/>
-                <w:sz w:val="20"/>
-                <w:szCs w:val="20"/>
-              </w:rPr>
-            </w:pPr>
-            <w:r>
-              <w:rPr>
-                <w:rFonts w:ascii="Times New Roman" w:hAnsi="Times New Roman" w:cs="Times New Roman"/>
-                <w:sz w:val="20"/>
-                <w:szCs w:val="20"/>
-              </w:rPr>
-              <w:t>Prompt</w:t>
-            </w:r>
-            <w:r>
-              <w:rPr>
-                <w:rFonts w:ascii="Times New Roman" w:hAnsi="Times New Roman" w:cs="Times New Roman"/>
-                <w:sz w:val="20"/>
-                <w:szCs w:val="20"/>
-                <w:lang w:eastAsia="zh-CN"/>
-              </w:rPr>
-              <w:t xml:space="preserve"> 1</w:t>
-            </w:r>
-            <w:r>
-              <w:rPr>
-                <w:rFonts w:ascii="Times New Roman" w:hAnsi="Times New Roman" w:cs="Times New Roman"/>
-                <w:sz w:val="20"/>
-                <w:szCs w:val="20"/>
-                <w:lang w:eastAsia="zh-CN"/>
-              </w:rPr>
-              <w:t>:</w:t>
-            </w:r>
-          </w:p>
-          <w:p>
-            <w:pPr>
-              <w:spacing w:line="276" w:lineRule="auto"/>
-              <w:rPr>
-                <w:rFonts w:ascii="Times New Roman" w:hAnsi="Times New Roman" w:cs="Times New Roman"/>
-                <w:sz w:val="20"/>
-                <w:szCs w:val="20"/>
-                <w:lang w:eastAsia="zh-CN"/>
-              </w:rPr>
-            </w:pPr>
-            <w:r>
-              <w:rPr>
-                <w:rFonts w:ascii="Times New Roman" w:hAnsi="Times New Roman" w:cs="Times New Roman"/>
-                <w:sz w:val="20"/>
-                <w:szCs w:val="20"/>
-                <w:lang w:eastAsia="zh-CN"/>
-              </w:rPr>
-              <w:t>“</w:t>
-            </w:r>
-            <w:r>
-              <w:rPr>
-                <w:rFonts w:ascii="Times New Roman" w:hAnsi="Times New Roman" w:cs="Times New Roman"/>
-                <w:sz w:val="20"/>
-                <w:szCs w:val="20"/>
-              </w:rPr>
-              <w:t xml:space="preserve">I recorded operational data of a company for the daily tourists and staff numbers , some numbers were random or wrong as well , </w:t>
-            </w:r>
-            <w:r>
-              <w:rPr>
-                <w:rFonts w:ascii="Times New Roman" w:hAnsi="Times New Roman" w:cs="Times New Roman"/>
-                <w:sz w:val="20"/>
-                <w:szCs w:val="20"/>
-              </w:rPr>
-              <w:t>I</w:t>
-            </w:r>
-            <w:r>
-              <w:rPr>
-                <w:rFonts w:ascii="Times New Roman" w:hAnsi="Times New Roman" w:cs="Times New Roman"/>
-                <w:sz w:val="20"/>
-                <w:szCs w:val="20"/>
-              </w:rPr>
-              <w:t xml:space="preserve"> want to use it to do my CA project for data ana</w:t>
-            </w:r>
-            <w:r>
-              <w:rPr>
-                <w:rFonts w:ascii="Times New Roman" w:hAnsi="Times New Roman" w:cs="Times New Roman"/>
-                <w:sz w:val="20"/>
-                <w:szCs w:val="20"/>
-                <w:lang w:eastAsia="zh-CN"/>
-              </w:rPr>
-              <w:t>ly</w:t>
-            </w:r>
-            <w:r>
-              <w:rPr>
-                <w:rFonts w:ascii="Times New Roman" w:hAnsi="Times New Roman" w:cs="Times New Roman"/>
-                <w:sz w:val="20"/>
-                <w:szCs w:val="20"/>
-              </w:rPr>
-              <w:t>sis,</w:t>
-            </w:r>
-            <w:r>
-              <w:rPr>
-                <w:rFonts w:ascii="Times New Roman" w:hAnsi="Times New Roman" w:cs="Times New Roman"/>
-                <w:sz w:val="20"/>
-                <w:szCs w:val="20"/>
-              </w:rPr>
-              <w:t xml:space="preserve"> I</w:t>
-            </w:r>
-            <w:r>
-              <w:rPr>
-                <w:rFonts w:ascii="Times New Roman" w:hAnsi="Times New Roman" w:cs="Times New Roman"/>
-                <w:sz w:val="20"/>
-                <w:szCs w:val="20"/>
-              </w:rPr>
-              <w:t xml:space="preserve"> changed or deleted some columns and rename them by masking the data, can you generate a 100% legal raw dataset based on the dataset </w:t>
-            </w:r>
-            <w:r>
-              <w:rPr>
-                <w:rFonts w:ascii="Times New Roman" w:hAnsi="Times New Roman" w:cs="Times New Roman"/>
-                <w:sz w:val="20"/>
-                <w:szCs w:val="20"/>
-              </w:rPr>
-              <w:t xml:space="preserve"> I </w:t>
-            </w:r>
-            <w:r>
-              <w:rPr>
-                <w:rFonts w:ascii="Times New Roman" w:hAnsi="Times New Roman" w:cs="Times New Roman"/>
-                <w:sz w:val="20"/>
-                <w:szCs w:val="20"/>
-              </w:rPr>
-              <w:t>already updated? do not clean the data, leave the raw data as it is . and tell me where you change the data exactly</w:t>
-            </w:r>
-            <w:r>
-              <w:rPr>
-                <w:rFonts w:ascii="Times New Roman" w:hAnsi="Times New Roman" w:cs="Times New Roman"/>
-                <w:sz w:val="20"/>
-                <w:szCs w:val="20"/>
-                <w:lang w:eastAsia="zh-CN"/>
-              </w:rPr>
-              <w:t>” (output:</w:t>
-            </w:r>
-            <w:r>
-              <w:rPr>
-                <w:rFonts w:ascii="Times New Roman" w:eastAsia="SimSun" w:hAnsi="Times New Roman" w:cs="Times New Roman"/>
-                <w:sz w:val="20"/>
-                <w:szCs w:val="20"/>
-                <w:lang w:eastAsia="zh-CN"/>
-              </w:rPr>
-              <w:t xml:space="preserve"> </w:t>
-            </w:r>
-            <w:r>
-              <w:rPr>
-                <w:rFonts w:ascii="Times New Roman" w:hAnsi="Times New Roman" w:cs="Times New Roman"/>
-                <w:sz w:val="20"/>
-                <w:szCs w:val="20"/>
-                <w:lang w:eastAsia="zh-CN"/>
-              </w:rPr>
-              <w:t>dataset)</w:t>
-            </w:r>
-          </w:p>
-          <w:p>
-            <w:pPr>
-              <w:spacing w:line="276" w:lineRule="auto"/>
-              <w:rPr>
-                <w:rFonts w:ascii="Times New Roman" w:hAnsi="Times New Roman" w:cs="Times New Roman"/>
-                <w:sz w:val="20"/>
-                <w:szCs w:val="20"/>
-                <w:lang w:eastAsia="zh-CN"/>
-              </w:rPr>
-            </w:pPr>
-          </w:p>
-          <w:p>
-            <w:pPr>
-              <w:spacing w:line="276" w:lineRule="auto"/>
-              <w:rPr>
-                <w:rFonts w:ascii="Times New Roman" w:hAnsi="Times New Roman" w:cs="Times New Roman"/>
-                <w:sz w:val="20"/>
-                <w:szCs w:val="20"/>
-              </w:rPr>
-            </w:pPr>
-            <w:r>
-              <w:rPr>
-                <w:rFonts w:ascii="Times New Roman" w:hAnsi="Times New Roman" w:cs="Times New Roman"/>
-                <w:sz w:val="20"/>
-                <w:szCs w:val="20"/>
-              </w:rPr>
-              <w:t xml:space="preserve">Prompt 2: </w:t>
-            </w:r>
-          </w:p>
-          <w:p>
-            <w:pPr>
-              <w:spacing w:line="276" w:lineRule="auto"/>
-              <w:rPr>
-                <w:rFonts w:ascii="Times New Roman" w:hAnsi="Times New Roman" w:cs="Times New Roman"/>
-                <w:sz w:val="20"/>
-                <w:szCs w:val="20"/>
-              </w:rPr>
-            </w:pPr>
-            <w:r>
-              <w:rPr>
-                <w:rFonts w:ascii="Times New Roman" w:hAnsi="Times New Roman" w:cs="Times New Roman"/>
-                <w:sz w:val="20"/>
-                <w:szCs w:val="20"/>
-              </w:rPr>
-              <w:t>“# Parameters</w:t>
-            </w:r>
-          </w:p>
-          <w:p>
-            <w:pPr>
-              <w:spacing w:line="276" w:lineRule="auto"/>
-              <w:rPr>
-                <w:rFonts w:ascii="Times New Roman" w:hAnsi="Times New Roman" w:cs="Times New Roman"/>
-                <w:sz w:val="20"/>
-                <w:szCs w:val="20"/>
-              </w:rPr>
-            </w:pPr>
-            <w:r>
-              <w:rPr>
-                <w:rFonts w:ascii="Times New Roman" w:hAnsi="Times New Roman" w:cs="Times New Roman"/>
-                <w:sz w:val="20"/>
-                <w:szCs w:val="20"/>
-              </w:rPr>
-              <w:t>lambda_vip = 484 </w:t>
-            </w:r>
-          </w:p>
-          <w:p>
-            <w:pPr>
-              <w:spacing w:line="276" w:lineRule="auto"/>
-              <w:rPr>
-                <w:rFonts w:ascii="Times New Roman" w:hAnsi="Times New Roman" w:cs="Times New Roman"/>
-                <w:sz w:val="20"/>
-                <w:szCs w:val="20"/>
-              </w:rPr>
-            </w:pPr>
-            <w:r>
-              <w:rPr>
-                <w:rFonts w:ascii="Times New Roman" w:hAnsi="Times New Roman" w:cs="Times New Roman"/>
-                <w:sz w:val="20"/>
-                <w:szCs w:val="20"/>
-              </w:rPr>
-              <w:t>k = np.arange(0, 501)  # number of having 500 VIP visitors (0 to 500)</w:t>
-            </w:r>
-          </w:p>
-          <w:p>
-            <w:pPr>
-              <w:spacing w:line="276" w:lineRule="auto"/>
-              <w:rPr>
-                <w:rFonts w:ascii="Times New Roman" w:hAnsi="Times New Roman" w:cs="Times New Roman"/>
-                <w:sz w:val="20"/>
-                <w:szCs w:val="20"/>
-              </w:rPr>
-            </w:pPr>
-            <w:r>
-              <w:rPr>
-                <w:rFonts w:ascii="Times New Roman" w:hAnsi="Times New Roman" w:cs="Times New Roman"/>
-                <w:sz w:val="20"/>
-                <w:szCs w:val="20"/>
-              </w:rPr>
-              <w:t># Poisson probability mass function (pmf)</w:t>
-            </w:r>
-          </w:p>
-          <w:p>
-            <w:pPr>
-              <w:spacing w:line="276" w:lineRule="auto"/>
-              <w:rPr>
-                <w:rFonts w:ascii="Times New Roman" w:hAnsi="Times New Roman" w:cs="Times New Roman"/>
-                <w:sz w:val="20"/>
-                <w:szCs w:val="20"/>
-                <w:lang w:eastAsia="zh-CN"/>
-              </w:rPr>
-            </w:pPr>
-            <w:r>
-              <w:rPr>
-                <w:rFonts w:ascii="Times New Roman" w:hAnsi="Times New Roman" w:cs="Times New Roman"/>
-                <w:sz w:val="20"/>
-                <w:szCs w:val="20"/>
-              </w:rPr>
-              <w:t>poisson_pmf = poisson.pmf(k, lambda_vip)</w:t>
-            </w:r>
-            <w:r>
-              <w:rPr>
-                <w:rFonts w:ascii="Times New Roman" w:hAnsi="Times New Roman" w:cs="Times New Roman"/>
-                <w:sz w:val="20"/>
-                <w:szCs w:val="20"/>
-                <w:lang w:eastAsia="zh-CN"/>
-              </w:rPr>
-              <w:t>”</w:t>
-            </w:r>
-          </w:p>
-          <w:p>
-            <w:pPr>
-              <w:spacing w:line="276" w:lineRule="auto"/>
-              <w:rPr>
-                <w:rFonts w:ascii="Times New Roman" w:hAnsi="Times New Roman" w:cs="Times New Roman"/>
-                <w:sz w:val="20"/>
-                <w:szCs w:val="20"/>
-                <w:lang w:eastAsia="zh-CN"/>
-              </w:rPr>
-            </w:pPr>
-            <w:r>
-              <w:rPr>
-                <w:rFonts w:ascii="Times New Roman" w:hAnsi="Times New Roman" w:cs="Times New Roman"/>
-                <w:sz w:val="20"/>
-                <w:szCs w:val="20"/>
-                <w:lang w:eastAsia="zh-CN"/>
-              </w:rPr>
-              <w:t>(output: correct python code)</w:t>
-            </w:r>
-          </w:p>
-          <w:p>
-            <w:pPr>
-              <w:spacing w:line="276" w:lineRule="auto"/>
-              <w:rPr>
-                <w:rFonts w:ascii="Times New Roman" w:eastAsia="SimSun" w:hAnsi="Times New Roman" w:cs="Times New Roman"/>
-                <w:sz w:val="20"/>
-                <w:szCs w:val="20"/>
-                <w:lang w:eastAsia="zh-CN"/>
-              </w:rPr>
-            </w:pPr>
-          </w:p>
-          <w:p>
-            <w:pPr>
-              <w:spacing w:line="276" w:lineRule="auto"/>
-              <w:rPr>
-                <w:rFonts w:ascii="Times New Roman" w:eastAsia="SimSun" w:hAnsi="Times New Roman" w:cs="Times New Roman"/>
-                <w:sz w:val="20"/>
-                <w:szCs w:val="20"/>
-                <w:lang w:eastAsia="zh-CN"/>
-              </w:rPr>
-            </w:pPr>
-          </w:p>
-        </w:tc>
-      </w:tr>
-      <w:tr>
-        <w:tc>
-          <w:tcPr>
-            <w:tcW w:w="1701" w:type="dxa"/>
-          </w:tcPr>
-          <w:p>
-            <w:pPr>
-              <w:spacing w:line="276" w:lineRule="auto"/>
-              <w:rPr>
-                <w:rFonts w:ascii="Times New Roman" w:hAnsi="Times New Roman" w:cs="Times New Roman"/>
-                <w:b/>
-                <w:bCs/>
-                <w:sz w:val="20"/>
-                <w:szCs w:val="20"/>
-              </w:rPr>
-            </w:pPr>
-          </w:p>
-          <w:p>
-            <w:pPr>
-              <w:spacing w:line="276" w:lineRule="auto"/>
-              <w:rPr>
-                <w:rFonts w:ascii="Times New Roman" w:hAnsi="Times New Roman" w:cs="Times New Roman"/>
-                <w:b/>
-                <w:bCs/>
-                <w:sz w:val="20"/>
-                <w:szCs w:val="20"/>
-              </w:rPr>
-            </w:pPr>
-          </w:p>
-          <w:p>
-            <w:pPr>
-              <w:spacing w:line="276" w:lineRule="auto"/>
-              <w:rPr>
-                <w:rFonts w:ascii="Times New Roman" w:hAnsi="Times New Roman" w:cs="Times New Roman"/>
-                <w:b/>
-                <w:bCs/>
-                <w:sz w:val="20"/>
-                <w:szCs w:val="20"/>
-              </w:rPr>
-            </w:pPr>
-          </w:p>
-          <w:p>
-            <w:pPr>
-              <w:spacing w:line="276" w:lineRule="auto"/>
-              <w:rPr>
-                <w:rFonts w:ascii="Times New Roman" w:hAnsi="Times New Roman" w:cs="Times New Roman"/>
-                <w:b/>
-                <w:bCs/>
-                <w:sz w:val="20"/>
-                <w:szCs w:val="20"/>
-              </w:rPr>
-            </w:pPr>
-          </w:p>
-          <w:p>
-            <w:pPr>
-              <w:spacing w:line="276" w:lineRule="auto"/>
-              <w:rPr>
-                <w:rFonts w:ascii="Times New Roman" w:hAnsi="Times New Roman" w:cs="Times New Roman"/>
-                <w:b/>
-                <w:bCs/>
-                <w:sz w:val="20"/>
-                <w:szCs w:val="20"/>
-              </w:rPr>
-            </w:pPr>
-          </w:p>
-          <w:p>
-            <w:pPr>
-              <w:spacing w:line="276" w:lineRule="auto"/>
-              <w:rPr>
-                <w:rFonts w:ascii="Times New Roman" w:hAnsi="Times New Roman" w:cs="Times New Roman"/>
-                <w:sz w:val="20"/>
-                <w:szCs w:val="20"/>
-              </w:rPr>
-            </w:pPr>
-            <w:r>
-              <w:rPr>
-                <w:rFonts w:ascii="Times New Roman" w:hAnsi="Times New Roman" w:cs="Times New Roman"/>
-                <w:b/>
-                <w:bCs/>
-                <w:sz w:val="20"/>
-                <w:szCs w:val="20"/>
-              </w:rPr>
-              <w:t>Discernment</w:t>
-            </w:r>
-          </w:p>
-          <w:p>
-            <w:pPr>
-              <w:spacing w:line="276" w:lineRule="auto"/>
-              <w:rPr>
-                <w:rFonts w:ascii="Times New Roman" w:hAnsi="Times New Roman" w:cs="Times New Roman"/>
-                <w:sz w:val="20"/>
-                <w:szCs w:val="20"/>
-              </w:rPr>
-            </w:pPr>
-            <w:r>
-              <w:rPr>
-                <w:rFonts w:ascii="Times New Roman" w:hAnsi="Times New Roman" w:cs="Times New Roman"/>
-                <w:sz w:val="20"/>
-                <w:szCs w:val="20"/>
-              </w:rPr>
-              <w:t>Evaluating what the AI produced</w:t>
-            </w:r>
-          </w:p>
-        </w:tc>
-        <w:tc>
-          <w:tcPr>
-            <w:tcW w:w="2977" w:type="dxa"/>
-          </w:tcPr>
-          <w:p>
-            <w:pPr>
-              <w:spacing w:line="276" w:lineRule="auto"/>
-              <w:rPr>
-                <w:rFonts w:ascii="Times New Roman" w:hAnsi="Times New Roman" w:cs="Times New Roman"/>
-                <w:sz w:val="20"/>
-                <w:szCs w:val="20"/>
-              </w:rPr>
-            </w:pPr>
-          </w:p>
-          <w:p>
-            <w:pPr>
-              <w:spacing w:line="276" w:lineRule="auto"/>
-              <w:rPr>
-                <w:rFonts w:ascii="Times New Roman" w:hAnsi="Times New Roman" w:cs="Times New Roman"/>
-                <w:sz w:val="20"/>
-                <w:szCs w:val="20"/>
-              </w:rPr>
-            </w:pPr>
-          </w:p>
-          <w:p>
-            <w:pPr>
-              <w:spacing w:line="276" w:lineRule="auto"/>
-              <w:rPr>
-                <w:rFonts w:ascii="Times New Roman" w:hAnsi="Times New Roman" w:cs="Times New Roman"/>
-                <w:sz w:val="20"/>
-                <w:szCs w:val="20"/>
-              </w:rPr>
-            </w:pPr>
-          </w:p>
-          <w:p>
-            <w:pPr>
-              <w:spacing w:line="276" w:lineRule="auto"/>
-              <w:rPr>
-                <w:rFonts w:ascii="Times New Roman" w:hAnsi="Times New Roman" w:cs="Times New Roman"/>
-                <w:sz w:val="20"/>
-                <w:szCs w:val="20"/>
-              </w:rPr>
-            </w:pPr>
-            <w:r>
-              <w:rPr>
-                <w:rFonts w:ascii="Times New Roman" w:hAnsi="Times New Roman" w:cs="Times New Roman"/>
-                <w:sz w:val="20"/>
-                <w:szCs w:val="20"/>
-              </w:rPr>
-              <w:t>In your reflection, critically evaluate the AI output: what did you accept, modify, or reject — and why? Assess accuracy, relevance, and quality. You are responsible for verifying all AI-generated content before submitting.</w:t>
-            </w:r>
-          </w:p>
-        </w:tc>
-        <w:tc>
-          <w:tcPr>
-            <w:tcW w:w="2126" w:type="dxa"/>
-          </w:tcPr>
-          <w:p>
-            <w:pPr>
-              <w:spacing w:line="276" w:lineRule="auto"/>
-              <w:rPr>
-                <w:rFonts w:ascii="Times New Roman" w:hAnsi="Times New Roman" w:cs="Times New Roman"/>
-                <w:sz w:val="20"/>
-                <w:szCs w:val="20"/>
-              </w:rPr>
-            </w:pPr>
-          </w:p>
-          <w:p>
-            <w:pPr>
-              <w:spacing w:line="276" w:lineRule="auto"/>
-              <w:rPr>
-                <w:rFonts w:ascii="Times New Roman" w:hAnsi="Times New Roman" w:cs="Times New Roman"/>
-                <w:sz w:val="20"/>
-                <w:szCs w:val="20"/>
-              </w:rPr>
-            </w:pPr>
-          </w:p>
-          <w:p>
-            <w:pPr>
-              <w:spacing w:line="276" w:lineRule="auto"/>
-              <w:rPr>
-                <w:rFonts w:ascii="Times New Roman" w:hAnsi="Times New Roman" w:cs="Times New Roman"/>
-                <w:sz w:val="20"/>
-                <w:szCs w:val="20"/>
-              </w:rPr>
-            </w:pPr>
-          </w:p>
-          <w:p>
-            <w:pPr>
-              <w:spacing w:line="276" w:lineRule="auto"/>
-              <w:rPr>
-                <w:rFonts w:ascii="Times New Roman" w:hAnsi="Times New Roman" w:cs="Times New Roman"/>
-                <w:sz w:val="20"/>
-                <w:szCs w:val="20"/>
-              </w:rPr>
-            </w:pPr>
-            <w:r>
-              <w:rPr>
-                <w:rFonts w:ascii="Times New Roman" w:hAnsi="Times New Roman" w:cs="Times New Roman"/>
-                <w:sz w:val="20"/>
-                <w:szCs w:val="20"/>
-              </w:rPr>
-              <w:t>You are responsible for checking, testing and understanding any AI-generated code or suggestions before using them in your work.</w:t>
-            </w:r>
-          </w:p>
-          <w:p>
-            <w:pPr>
-              <w:spacing w:line="276" w:lineRule="auto"/>
-              <w:rPr>
-                <w:rFonts w:ascii="Times New Roman" w:hAnsi="Times New Roman" w:cs="Times New Roman"/>
-                <w:sz w:val="20"/>
-                <w:szCs w:val="20"/>
-              </w:rPr>
-            </w:pPr>
-          </w:p>
-          <w:p>
-            <w:pPr>
-              <w:spacing w:line="276" w:lineRule="auto"/>
-              <w:rPr>
-                <w:rFonts w:ascii="Times New Roman" w:hAnsi="Times New Roman" w:cs="Times New Roman"/>
-                <w:sz w:val="20"/>
-                <w:szCs w:val="20"/>
-              </w:rPr>
-            </w:pPr>
-          </w:p>
-        </w:tc>
-        <w:tc>
-          <w:tcPr>
-            <w:tcW w:w="4253" w:type="dxa"/>
-          </w:tcPr>
-          <w:p>
-            <w:pPr>
-              <w:spacing w:line="276" w:lineRule="auto"/>
-              <w:rPr>
-                <w:rFonts w:ascii="Times New Roman" w:hAnsi="Times New Roman" w:cs="Times New Roman"/>
-                <w:sz w:val="20"/>
-                <w:szCs w:val="20"/>
-              </w:rPr>
-            </w:pPr>
-          </w:p>
-          <w:p>
-            <w:pPr>
-              <w:spacing w:line="276" w:lineRule="auto"/>
-              <w:rPr>
-                <w:rFonts w:ascii="Times New Roman" w:hAnsi="Times New Roman" w:cs="Times New Roman"/>
-                <w:sz w:val="20"/>
-                <w:szCs w:val="20"/>
-              </w:rPr>
-            </w:pPr>
-          </w:p>
-          <w:p>
-            <w:pPr>
-              <w:spacing w:line="276" w:lineRule="auto"/>
-              <w:rPr>
-                <w:rFonts w:ascii="Times New Roman" w:hAnsi="Times New Roman" w:cs="Times New Roman"/>
-                <w:sz w:val="20"/>
-                <w:szCs w:val="20"/>
-              </w:rPr>
-            </w:pPr>
-            <w:r>
-              <w:rPr>
-                <w:rFonts w:ascii="Times New Roman" w:hAnsi="Times New Roman" w:cs="Times New Roman"/>
-                <w:sz w:val="20"/>
-                <w:szCs w:val="20"/>
-              </w:rPr>
-              <w:t>Briefly explain how you verified the AI output and what you accepted, modified or rejected.</w:t>
-            </w:r>
-          </w:p>
-          <w:p>
-            <w:pPr>
-              <w:spacing w:line="276" w:lineRule="auto"/>
-              <w:rPr>
-                <w:rFonts w:ascii="Times New Roman" w:hAnsi="Times New Roman" w:cs="Times New Roman"/>
-                <w:sz w:val="20"/>
-                <w:szCs w:val="20"/>
-              </w:rPr>
-            </w:pPr>
-          </w:p>
-          <w:p>
-            <w:pPr>
-              <w:spacing w:line="276" w:lineRule="auto"/>
-              <w:rPr>
-                <w:rFonts w:ascii="Times New Roman" w:hAnsi="Times New Roman" w:cs="Times New Roman"/>
-                <w:sz w:val="20"/>
-                <w:szCs w:val="20"/>
-                <w:lang w:eastAsia="zh-CN"/>
-              </w:rPr>
-            </w:pPr>
-            <w:r>
-              <w:rPr>
-                <w:rFonts w:ascii="Times New Roman" w:hAnsi="Times New Roman" w:cs="Times New Roman"/>
-                <w:sz w:val="20"/>
-                <w:szCs w:val="20"/>
-                <w:lang w:eastAsia="zh-CN"/>
-              </w:rPr>
-              <w:t>1.I accept the AI output as it utilizes for this analysis and turns the original dataset into simulated and anonymized operational time-series records representing visitor numbers and staffing allocations across operational departments, which is workable for my project. But as in real practice, there are traffic peak on public and bank holidays like St</w:t>
-            </w:r>
-            <w:r>
-              <w:rPr>
-                <w:rFonts w:ascii="Times New Roman" w:eastAsia="SimSun" w:hAnsi="Times New Roman" w:cs="Times New Roman"/>
-                <w:sz w:val="20"/>
-                <w:szCs w:val="20"/>
-                <w:lang w:eastAsia="zh-CN"/>
-              </w:rPr>
-              <w:t xml:space="preserve"> </w:t>
-            </w:r>
-            <w:r>
-              <w:rPr>
-                <w:rFonts w:ascii="Times New Roman" w:hAnsi="Times New Roman" w:cs="Times New Roman"/>
-                <w:sz w:val="20"/>
-                <w:szCs w:val="20"/>
-                <w:lang w:eastAsia="zh-CN"/>
-              </w:rPr>
-              <w:t>Patrick Day,</w:t>
-            </w:r>
-            <w:r>
-              <w:rPr>
-                <w:rFonts w:ascii="Times New Roman" w:eastAsia="SimSun" w:hAnsi="Times New Roman" w:cs="Times New Roman"/>
-                <w:sz w:val="20"/>
-                <w:szCs w:val="20"/>
-                <w:lang w:eastAsia="zh-CN"/>
-              </w:rPr>
-              <w:t xml:space="preserve"> </w:t>
-            </w:r>
-            <w:r>
-              <w:rPr>
-                <w:rFonts w:ascii="Times New Roman" w:hAnsi="Times New Roman" w:cs="Times New Roman"/>
-                <w:sz w:val="20"/>
-                <w:szCs w:val="20"/>
-                <w:lang w:eastAsia="zh-CN"/>
-              </w:rPr>
-              <w:t>Xmas,</w:t>
-            </w:r>
-            <w:r>
-              <w:rPr>
-                <w:rFonts w:ascii="Times New Roman" w:eastAsia="SimSun" w:hAnsi="Times New Roman" w:cs="Times New Roman"/>
-                <w:sz w:val="20"/>
-                <w:szCs w:val="20"/>
-                <w:lang w:eastAsia="zh-CN"/>
-              </w:rPr>
-              <w:t xml:space="preserve"> </w:t>
-            </w:r>
-            <w:r>
-              <w:rPr>
-                <w:rFonts w:ascii="Times New Roman" w:hAnsi="Times New Roman" w:cs="Times New Roman"/>
-                <w:sz w:val="20"/>
-                <w:szCs w:val="20"/>
-                <w:lang w:eastAsia="zh-CN"/>
-              </w:rPr>
-              <w:t>and New Year’s day, I adjusted the numbers for those public holidays in order to get a more accurate analysis.</w:t>
-            </w:r>
-          </w:p>
-          <w:p>
-            <w:pPr>
-              <w:spacing w:line="276" w:lineRule="auto"/>
-              <w:rPr>
-                <w:rFonts w:ascii="Times New Roman" w:hAnsi="Times New Roman" w:cs="Times New Roman"/>
-                <w:sz w:val="20"/>
-                <w:szCs w:val="20"/>
-                <w:lang w:eastAsia="zh-CN"/>
-              </w:rPr>
-            </w:pPr>
-          </w:p>
-          <w:p>
-            <w:pPr>
-              <w:spacing w:line="276" w:lineRule="auto"/>
-              <w:rPr>
-                <w:rFonts w:ascii="Times New Roman" w:hAnsi="Times New Roman" w:cs="Times New Roman"/>
-                <w:sz w:val="20"/>
-                <w:szCs w:val="20"/>
-                <w:lang w:eastAsia="zh-CN"/>
-              </w:rPr>
-            </w:pPr>
-            <w:r>
-              <w:rPr>
-                <w:rFonts w:ascii="Times New Roman" w:hAnsi="Times New Roman" w:cs="Times New Roman"/>
-                <w:sz w:val="20"/>
-                <w:szCs w:val="20"/>
-                <w:lang w:eastAsia="zh-CN"/>
-              </w:rPr>
-              <w:t>2. I fully accept the AI output as it is the correct way to get the right distribution for a large data range from 0-500.</w:t>
-            </w:r>
-          </w:p>
-          <w:p>
-            <w:pPr>
-              <w:spacing w:line="276" w:lineRule="auto"/>
-              <w:rPr>
-                <w:rFonts w:ascii="Times New Roman" w:hAnsi="Times New Roman" w:cs="Times New Roman"/>
-                <w:sz w:val="20"/>
-                <w:szCs w:val="20"/>
-              </w:rPr>
-            </w:pPr>
-          </w:p>
-        </w:tc>
-      </w:tr>
-      <w:tr>
-        <w:trPr>
-          <w:trHeight w:val="3034"/>
-        </w:trPr>
-        <w:tc>
-          <w:tcPr>
-            <w:tcW w:w="1701" w:type="dxa"/>
-          </w:tcPr>
-          <w:p>
-            <w:pPr>
-              <w:spacing w:line="276" w:lineRule="auto"/>
-              <w:rPr>
-                <w:rFonts w:ascii="Times New Roman" w:hAnsi="Times New Roman" w:cs="Times New Roman"/>
-                <w:b/>
-                <w:bCs/>
-                <w:sz w:val="20"/>
-                <w:szCs w:val="20"/>
-              </w:rPr>
-            </w:pPr>
-          </w:p>
-          <w:p>
-            <w:pPr>
-              <w:spacing w:line="276" w:lineRule="auto"/>
-              <w:rPr>
-                <w:rFonts w:ascii="Times New Roman" w:hAnsi="Times New Roman" w:cs="Times New Roman"/>
-                <w:b/>
-                <w:bCs/>
-                <w:sz w:val="20"/>
-                <w:szCs w:val="20"/>
-              </w:rPr>
-            </w:pPr>
-          </w:p>
-          <w:p>
-            <w:pPr>
-              <w:spacing w:line="276" w:lineRule="auto"/>
-              <w:rPr>
-                <w:rFonts w:ascii="Times New Roman" w:hAnsi="Times New Roman" w:cs="Times New Roman"/>
-                <w:b/>
-                <w:bCs/>
-                <w:sz w:val="20"/>
-                <w:szCs w:val="20"/>
-              </w:rPr>
-            </w:pPr>
-          </w:p>
-          <w:p>
-            <w:pPr>
-              <w:spacing w:line="276" w:lineRule="auto"/>
-              <w:rPr>
-                <w:rFonts w:ascii="Times New Roman" w:hAnsi="Times New Roman" w:cs="Times New Roman"/>
-                <w:sz w:val="20"/>
-                <w:szCs w:val="20"/>
-              </w:rPr>
-            </w:pPr>
-            <w:r>
-              <w:rPr>
-                <w:rFonts w:ascii="Times New Roman" w:hAnsi="Times New Roman" w:cs="Times New Roman"/>
-                <w:b/>
-                <w:bCs/>
-                <w:sz w:val="20"/>
-                <w:szCs w:val="20"/>
-              </w:rPr>
-              <w:t>Diligence</w:t>
-            </w:r>
-          </w:p>
-          <w:p>
-            <w:pPr>
-              <w:spacing w:line="276" w:lineRule="auto"/>
-              <w:rPr>
-                <w:rFonts w:ascii="Times New Roman" w:hAnsi="Times New Roman" w:cs="Times New Roman"/>
-                <w:b/>
-                <w:bCs/>
-                <w:sz w:val="20"/>
-                <w:szCs w:val="20"/>
-              </w:rPr>
-            </w:pPr>
-            <w:r>
-              <w:rPr>
-                <w:rFonts w:ascii="Times New Roman" w:hAnsi="Times New Roman" w:cs="Times New Roman"/>
-                <w:sz w:val="20"/>
-                <w:szCs w:val="20"/>
-              </w:rPr>
-              <w:t>Responsibility for your AI use</w:t>
-            </w:r>
-          </w:p>
-        </w:tc>
-        <w:tc>
-          <w:tcPr>
-            <w:tcW w:w="2977" w:type="dxa"/>
-          </w:tcPr>
-          <w:p>
-            <w:pPr>
-              <w:spacing w:line="276" w:lineRule="auto"/>
-              <w:rPr>
-                <w:rFonts w:ascii="Times New Roman" w:hAnsi="Times New Roman" w:cs="Times New Roman"/>
-                <w:sz w:val="20"/>
-                <w:szCs w:val="20"/>
-              </w:rPr>
-            </w:pPr>
-            <w:r>
-              <w:rPr>
-                <w:rFonts w:ascii="Times New Roman" w:hAnsi="Times New Roman" w:cs="Times New Roman"/>
-                <w:sz w:val="20"/>
-                <w:szCs w:val="20"/>
-              </w:rPr>
-              <w:t>Declare all AI tools used and cite them here. Briefly outline how you considered data protection, copyright, and ethical responsibilities when choosing what to input into any AI system. Unauthor</w:t>
-            </w:r>
-            <w:r>
-              <w:rPr>
-                <w:rFonts w:ascii="Times New Roman" w:hAnsi="Times New Roman" w:cs="Times New Roman"/>
-                <w:sz w:val="20"/>
-                <w:szCs w:val="20"/>
-              </w:rPr>
-              <w:t>iz</w:t>
-            </w:r>
-            <w:r>
-              <w:rPr>
-                <w:rFonts w:ascii="Times New Roman" w:hAnsi="Times New Roman" w:cs="Times New Roman"/>
-                <w:sz w:val="20"/>
-                <w:szCs w:val="20"/>
-              </w:rPr>
-              <w:t>ed use is subject to CCT disciplinary procedures.</w:t>
-            </w:r>
-          </w:p>
-        </w:tc>
-        <w:tc>
-          <w:tcPr>
-            <w:tcW w:w="2126" w:type="dxa"/>
-          </w:tcPr>
-          <w:p>
-            <w:pPr>
-              <w:spacing w:line="276" w:lineRule="auto"/>
-              <w:rPr>
-                <w:rFonts w:ascii="Times New Roman" w:hAnsi="Times New Roman" w:cs="Times New Roman"/>
-                <w:sz w:val="20"/>
-                <w:szCs w:val="20"/>
-              </w:rPr>
-            </w:pPr>
-            <w:r>
-              <w:rPr>
-                <w:rFonts w:ascii="Times New Roman" w:hAnsi="Times New Roman" w:cs="Times New Roman"/>
-                <w:sz w:val="20"/>
-                <w:szCs w:val="20"/>
-              </w:rPr>
-              <w:t>Declare all AI tools used. Do not enter personal, confidential or sensitive information into AI tools. Any external sources used should be appropriately referenced.</w:t>
-            </w:r>
-          </w:p>
-          <w:p>
-            <w:pPr>
-              <w:spacing w:line="276" w:lineRule="auto"/>
-              <w:rPr>
-                <w:rFonts w:ascii="Times New Roman" w:hAnsi="Times New Roman" w:cs="Times New Roman"/>
-                <w:sz w:val="20"/>
-                <w:szCs w:val="20"/>
-              </w:rPr>
-            </w:pPr>
-          </w:p>
-          <w:p>
-            <w:pPr>
-              <w:spacing w:line="276" w:lineRule="auto"/>
-              <w:rPr>
-                <w:rFonts w:ascii="Times New Roman" w:hAnsi="Times New Roman" w:cs="Times New Roman"/>
-                <w:sz w:val="20"/>
-                <w:szCs w:val="20"/>
-              </w:rPr>
-            </w:pPr>
-          </w:p>
-          <w:p>
-            <w:pPr>
-              <w:pStyle w:val="ListParagraph"/>
-              <w:spacing w:line="276" w:lineRule="auto"/>
-              <w:ind w:left="403"/>
-              <w:rPr>
-                <w:rFonts w:ascii="Times New Roman" w:hAnsi="Times New Roman" w:cs="Times New Roman"/>
-                <w:sz w:val="20"/>
-                <w:szCs w:val="20"/>
-              </w:rPr>
-            </w:pPr>
-          </w:p>
-        </w:tc>
-        <w:tc>
-          <w:tcPr>
-            <w:tcW w:w="4253" w:type="dxa"/>
-          </w:tcPr>
-          <w:p>
-            <w:pPr>
-              <w:spacing w:line="276" w:lineRule="auto"/>
-              <w:rPr>
-                <w:rFonts w:ascii="Times New Roman" w:hAnsi="Times New Roman" w:cs="Times New Roman"/>
-                <w:sz w:val="20"/>
-                <w:szCs w:val="20"/>
-              </w:rPr>
-            </w:pPr>
-            <w:r>
-              <w:rPr>
-                <w:rFonts w:ascii="Times New Roman" w:hAnsi="Times New Roman" w:cs="Times New Roman"/>
-                <w:sz w:val="20"/>
-                <w:szCs w:val="20"/>
-              </w:rPr>
-              <w:t>List the AI tools used and briefly explain how you used them responsibly.</w:t>
-            </w:r>
-          </w:p>
-          <w:p>
-            <w:pPr>
-              <w:spacing w:line="276" w:lineRule="auto"/>
-              <w:rPr>
-                <w:rFonts w:ascii="Times New Roman" w:hAnsi="Times New Roman" w:cs="Times New Roman"/>
-                <w:sz w:val="20"/>
-                <w:szCs w:val="20"/>
-              </w:rPr>
-            </w:pPr>
-          </w:p>
-          <w:p>
-            <w:pPr>
-              <w:spacing w:line="276" w:lineRule="auto"/>
-              <w:rPr>
-                <w:rFonts w:ascii="Times New Roman" w:hAnsi="Times New Roman" w:cs="Times New Roman"/>
-                <w:sz w:val="20"/>
-                <w:szCs w:val="20"/>
-                <w:lang w:eastAsia="zh-CN"/>
-              </w:rPr>
-            </w:pPr>
-            <w:r>
-              <w:rPr>
-                <w:rFonts w:ascii="Times New Roman" w:hAnsi="Times New Roman" w:cs="Times New Roman"/>
-                <w:sz w:val="20"/>
-                <w:szCs w:val="20"/>
-                <w:lang w:eastAsia="zh-CN"/>
-              </w:rPr>
-              <w:t xml:space="preserve">I used </w:t>
-            </w:r>
-            <w:r>
-              <w:rPr>
-                <w:rFonts w:ascii="Times New Roman" w:hAnsi="Times New Roman" w:cs="Times New Roman"/>
-                <w:sz w:val="20"/>
-                <w:szCs w:val="20"/>
-                <w:lang w:eastAsia="zh-CN"/>
-              </w:rPr>
-              <w:t>Gemini pro</w:t>
-            </w:r>
-            <w:r>
-              <w:rPr>
-                <w:rFonts w:ascii="Times New Roman" w:hAnsi="Times New Roman" w:cs="Times New Roman"/>
-                <w:sz w:val="20"/>
-                <w:szCs w:val="20"/>
-                <w:lang w:eastAsia="zh-CN"/>
-              </w:rPr>
-              <w:t xml:space="preserve"> for the research and I use it </w:t>
-            </w:r>
-            <w:r>
-              <w:rPr>
-                <w:rFonts w:ascii="Times New Roman" w:hAnsi="Times New Roman" w:cs="Times New Roman"/>
-                <w:sz w:val="20"/>
-                <w:szCs w:val="20"/>
-                <w:lang w:eastAsia="zh-CN"/>
-              </w:rPr>
-              <w:t xml:space="preserve">responsibly </w:t>
-            </w:r>
-            <w:r>
-              <w:rPr>
-                <w:rFonts w:ascii="Times New Roman" w:hAnsi="Times New Roman" w:cs="Times New Roman"/>
-                <w:sz w:val="20"/>
-                <w:szCs w:val="20"/>
-                <w:lang w:eastAsia="zh-CN"/>
-              </w:rPr>
-              <w:t>to solve specific data problems, coding issues only.</w:t>
-            </w:r>
-          </w:p>
-        </w:tc>
-      </w:tr>
-    </w:tbl>
-    <w:p>
-      <w:pPr>
-        <w:rPr>
-          <w:rFonts w:ascii="Times New Roman" w:hAnsi="Times New Roman" w:cs="Times New Roman"/>
-          <w:color w:val="FF0000"/>
-        </w:rPr>
-      </w:pPr>
-    </w:p>
-    <w:p>
-      <w:pPr>
-        <w:rPr>
-          <w:rFonts w:ascii="Times New Roman" w:eastAsia="SimSun" w:hAnsi="Times New Roman" w:cs="Times New Roman"/>
-          <w:lang w:eastAsia="zh-CN"/>
-        </w:rPr>
-      </w:pPr>
-    </w:p>
-    <w:p>
-      <w:pPr>
-        <w:rPr>
-          <w:rFonts w:ascii="Times New Roman" w:eastAsia="SimSun" w:hAnsi="Times New Roman" w:cs="Times New Roman"/>
-          <w:lang w:eastAsia="zh-CN"/>
-        </w:rPr>
-      </w:pPr>
-    </w:p>
-    <w:p>
-      <w:pPr>
-        <w:rPr>
-          <w:rFonts w:ascii="Times New Roman" w:eastAsia="SimSun" w:hAnsi="Times New Roman" w:cs="Times New Roman"/>
-          <w:lang w:eastAsia="zh-CN"/>
-        </w:rPr>
-      </w:pPr>
-    </w:p>
-    <w:p>
-      <w:pPr>
-        <w:rPr>
-          <w:rFonts w:ascii="Times New Roman" w:eastAsia="SimSun" w:hAnsi="Times New Roman" w:cs="Times New Roman"/>
-          <w:lang w:eastAsia="zh-CN"/>
-        </w:rPr>
-      </w:pPr>
-    </w:p>
-    <w:p>
-      <w:pPr>
-        <w:rPr>
-          <w:rFonts w:ascii="Times New Roman" w:eastAsia="SimSun" w:hAnsi="Times New Roman" w:cs="Times New Roman"/>
-          <w:lang w:eastAsia="zh-CN"/>
-        </w:rPr>
-      </w:pPr>
-    </w:p>
-    <w:p>
-      <w:pPr>
-        <w:rPr>
-          <w:rFonts w:ascii="Times New Roman" w:eastAsia="SimSun" w:hAnsi="Times New Roman" w:cs="Times New Roman"/>
-          <w:lang w:eastAsia="zh-CN"/>
-        </w:rPr>
-      </w:pPr>
-    </w:p>
-    <w:p>
-      <w:pPr>
-        <w:rPr>
-          <w:rFonts w:ascii="Times New Roman" w:eastAsia="SimSun" w:hAnsi="Times New Roman" w:cs="Times New Roman"/>
-          <w:lang w:eastAsia="zh-CN"/>
-        </w:rPr>
-      </w:pPr>
-    </w:p>
-    <w:p>
-      <w:pPr>
-        <w:rPr>
-          <w:rFonts w:ascii="Times New Roman" w:eastAsia="SimSun" w:hAnsi="Times New Roman" w:cs="Times New Roman"/>
-          <w:lang w:eastAsia="zh-CN"/>
-        </w:rPr>
-      </w:pPr>
-    </w:p>
-    <w:p>
-      <w:pPr>
-        <w:jc w:val="center"/>
-        <w:rPr>
-          <w:rFonts w:ascii="Times New Roman" w:eastAsia="SimSun" w:hAnsi="Times New Roman" w:cs="Times New Roman"/>
-          <w:lang w:eastAsia="zh-CN"/>
-        </w:rPr>
-      </w:pPr>
-    </w:p>
-    <w:p>
-      <w:pPr>
-        <w:jc w:val="center"/>
-        <w:rPr>
-          <w:rFonts w:ascii="Times New Roman" w:hAnsi="Times New Roman" w:cs="Times New Roman"/>
-          <w:noProof/>
-        </w:rPr>
-      </w:pPr>
-      <w:r>
-        <w:rPr>
-          <w:rFonts w:ascii="Times New Roman" w:hAnsi="Times New Roman" w:cs="Times New Roman"/>
-          <w:noProof/>
-        </w:rPr>
-        <w:drawing>
-          <wp:inline distT="0" distB="0" distL="0" distR="0" wp14:anchorId="29670B41" wp14:editId="71277E8C">
-            <wp:extent cx="5731510" cy="5560060"/>
-            <wp:effectExtent l="0" t="0" r="2540" b="2540"/>
-            <wp:docPr id="2" name="Picture 2"/>
-            <wp:cNvGraphicFramePr>
-              <a:graphicFrameLocks xmlns:a="http://schemas.openxmlformats.org/drawingml/2006/main" noChangeAspect="1"/>
-            </wp:cNvGraphicFramePr>
-            <a:graphic xmlns:a="http://schemas.openxmlformats.org/drawingml/2006/main">
-              <a:graphicData uri="http://schemas.openxmlformats.org/drawingml/2006/picture">
-                <pic:pic xmlns:pic="http://schemas.openxmlformats.org/drawingml/2006/picture">
-                  <pic:nvPicPr>
-                    <pic:cNvPr id="0" name="Picture 2"/>
-                    <pic:cNvPicPr>
-                      <a:picLocks noChangeAspect="1" noChangeArrowheads="1"/>
-                    </pic:cNvPicPr>
-                  </pic:nvPicPr>
-                  <pic:blipFill>
-                    <a:blip r:embed="rId18">
-                      <a:extLst>
-                        <a:ext uri="{28A0092B-C50C-407E-A947-70E740481C1C}">
-                          <a14:useLocalDpi xmlns:a14="http://schemas.microsoft.com/office/drawing/2010/main" val="0"/>
-                        </a:ext>
-                      </a:extLst>
-                    </a:blip>
-                    <a:srcRect/>
-                    <a:stretch>
-                      <a:fillRect/>
-                    </a:stretch>
-                  </pic:blipFill>
-                  <pic:spPr bwMode="auto">
-                    <a:xfrm>
-                      <a:off x="0" y="0"/>
-                      <a:ext cx="5731510" cy="5560060"/>
-                    </a:xfrm>
-                    <a:prstGeom prst="rect">
-                      <a:avLst/>
-                    </a:prstGeom>
-                    <a:noFill/>
-                    <a:ln>
-                      <a:noFill/>
-                    </a:ln>
-                  </pic:spPr>
-                </pic:pic>
-              </a:graphicData>
-            </a:graphic>
-          </wp:inline>
-        </w:drawing>
-      </w:r>
-    </w:p>
-    <w:p>
-      <w:pPr>
-        <w:jc w:val="center"/>
-        <w:rPr>
-          <w:rFonts w:ascii="Times New Roman" w:eastAsia="SimSun" w:hAnsi="Times New Roman" w:cs="Times New Roman"/>
-          <w:lang w:eastAsia="zh-CN"/>
-        </w:rPr>
-      </w:pPr>
-      <w:r>
-        <w:rPr>
-          <w:rFonts w:ascii="Times New Roman" w:hAnsi="Times New Roman" w:cs="Times New Roman"/>
-          <w:lang w:eastAsia="zh-CN"/>
-        </w:rPr>
-        <w:t>(</w:t>
-      </w:r>
-      <w:r>
-        <w:rPr>
-          <w:rFonts w:ascii="Times New Roman" w:hAnsi="Times New Roman" w:cs="Times New Roman"/>
-          <w:lang w:eastAsia="zh-CN"/>
-        </w:rPr>
-        <w:t>Prompt 1:</w:t>
-      </w:r>
-      <w:r>
-        <w:rPr>
-          <w:rFonts w:ascii="Times New Roman" w:eastAsia="SimSun" w:hAnsi="Times New Roman" w:cs="Times New Roman" w:hint="eastAsia"/>
-          <w:lang w:eastAsia="zh-CN"/>
-        </w:rPr>
-        <w:t xml:space="preserve"> screenshot</w:t>
-      </w:r>
-      <w:r>
-        <w:rPr>
-          <w:rFonts w:ascii="Times New Roman" w:eastAsia="SimSun" w:hAnsi="Times New Roman" w:cs="Times New Roman"/>
-          <w:lang w:eastAsia="zh-CN"/>
-        </w:rPr>
-        <w:t>)</w:t>
-      </w:r>
-    </w:p>
-    <w:p>
-      <w:pPr>
-        <w:jc w:val="center"/>
-        <w:rPr>
-          <w:rFonts w:ascii="Times New Roman" w:hAnsi="Times New Roman" w:cs="Times New Roman"/>
-          <w:noProof/>
-        </w:rPr>
-      </w:pPr>
-    </w:p>
-    <w:p>
-      <w:pPr>
-        <w:jc w:val="center"/>
-        <w:rPr>
-          <w:rFonts w:ascii="Times New Roman" w:eastAsia="SimSun" w:hAnsi="Times New Roman" w:cs="Times New Roman"/>
-          <w:noProof/>
-          <w:lang w:eastAsia="zh-CN"/>
-        </w:rPr>
-      </w:pPr>
-      <w:r>
-        <w:rPr>
-          <w:rFonts w:ascii="Times New Roman" w:hAnsi="Times New Roman" w:cs="Times New Roman"/>
-          <w:noProof/>
-        </w:rPr>
-        <w:lastRenderedPageBreak/>
-        <w:drawing>
-          <wp:inline distT="0" distB="0" distL="0" distR="0" wp14:anchorId="132EBB12" wp14:editId="5771B4F3">
-            <wp:extent cx="4968543" cy="3389244"/>
-            <wp:effectExtent l="0" t="0" r="3810" b="1905"/>
-            <wp:docPr id="3" name="Picture 3"/>
-            <wp:cNvGraphicFramePr>
-              <a:graphicFrameLocks xmlns:a="http://schemas.openxmlformats.org/drawingml/2006/main" noChangeAspect="1"/>
-            </wp:cNvGraphicFramePr>
-            <a:graphic xmlns:a="http://schemas.openxmlformats.org/drawingml/2006/main">
-              <a:graphicData uri="http://schemas.openxmlformats.org/drawingml/2006/picture">
-                <pic:pic xmlns:pic="http://schemas.openxmlformats.org/drawingml/2006/picture">
-                  <pic:nvPicPr>
-                    <pic:cNvPr id="1" name=""/>
-                    <pic:cNvPicPr/>
-                  </pic:nvPicPr>
-                  <pic:blipFill>
-                    <a:blip r:embed="rId19"/>
-                    <a:stretch>
-                      <a:fillRect/>
-                    </a:stretch>
-                  </pic:blipFill>
-                  <pic:spPr>
-                    <a:xfrm>
-                      <a:off x="0" y="0"/>
-                      <a:ext cx="4974268" cy="3393149"/>
-                    </a:xfrm>
-                    <a:prstGeom prst="rect">
-                      <a:avLst/>
-                    </a:prstGeom>
-                  </pic:spPr>
-                </pic:pic>
-              </a:graphicData>
-            </a:graphic>
-          </wp:inline>
-        </w:drawing>
-      </w:r>
-    </w:p>
-    <w:p>
-      <w:pPr>
-        <w:jc w:val="center"/>
-        <w:rPr>
-          <w:rFonts w:ascii="Times New Roman" w:hAnsi="Times New Roman" w:cs="Times New Roman"/>
-        </w:rPr>
-      </w:pPr>
-      <w:r>
-        <w:rPr>
-          <w:noProof/>
-        </w:rPr>
-        <w:drawing>
-          <wp:inline distT="0" distB="0" distL="0" distR="0" wp14:anchorId="6024D859" wp14:editId="137A07A6">
-            <wp:extent cx="4979504" cy="3676419"/>
-            <wp:effectExtent l="0" t="0" r="0" b="635"/>
-            <wp:docPr id="5" name="Picture 5"/>
-            <wp:cNvGraphicFramePr>
-              <a:graphicFrameLocks xmlns:a="http://schemas.openxmlformats.org/drawingml/2006/main" noChangeAspect="1"/>
-            </wp:cNvGraphicFramePr>
-            <a:graphic xmlns:a="http://schemas.openxmlformats.org/drawingml/2006/main">
-              <a:graphicData uri="http://schemas.openxmlformats.org/drawingml/2006/picture">
-                <pic:pic xmlns:pic="http://schemas.openxmlformats.org/drawingml/2006/picture">
-                  <pic:nvPicPr>
-                    <pic:cNvPr id="1" name=""/>
-                    <pic:cNvPicPr/>
-                  </pic:nvPicPr>
-                  <pic:blipFill>
-                    <a:blip r:embed="rId20"/>
-                    <a:stretch>
-                      <a:fillRect/>
-                    </a:stretch>
-                  </pic:blipFill>
-                  <pic:spPr>
-                    <a:xfrm>
-                      <a:off x="0" y="0"/>
-                      <a:ext cx="4983263" cy="3679194"/>
-                    </a:xfrm>
-                    <a:prstGeom prst="rect">
-                      <a:avLst/>
-                    </a:prstGeom>
-                  </pic:spPr>
-                </pic:pic>
-              </a:graphicData>
-            </a:graphic>
-          </wp:inline>
-        </w:drawing>
-      </w:r>
-    </w:p>
-    <w:p>
-      <w:pPr>
-        <w:jc w:val="center"/>
-        <w:rPr>
-          <w:rFonts w:ascii="Times New Roman" w:hAnsi="Times New Roman" w:cs="Times New Roman"/>
-        </w:rPr>
-      </w:pPr>
-      <w:r>
-        <w:rPr>
-          <w:rFonts w:ascii="Times New Roman" w:hAnsi="Times New Roman" w:cs="Times New Roman"/>
-          <w:noProof/>
-          <w:lang w:eastAsia="zh-CN"/>
-        </w:rPr>
-        <w:t>(</w:t>
-      </w:r>
-      <w:r>
-        <w:rPr>
-          <w:rFonts w:ascii="Times New Roman" w:hAnsi="Times New Roman" w:cs="Times New Roman"/>
-          <w:noProof/>
-          <w:lang w:eastAsia="zh-CN"/>
-        </w:rPr>
-        <w:t xml:space="preserve">Prompt 2: </w:t>
-      </w:r>
-      <w:r>
-        <w:rPr>
-          <w:rFonts w:ascii="Times New Roman" w:eastAsia="SimSun" w:hAnsi="Times New Roman" w:cs="Times New Roman" w:hint="eastAsia"/>
-          <w:noProof/>
-          <w:lang w:eastAsia="zh-CN"/>
-        </w:rPr>
-        <w:t>screenshot</w:t>
-      </w:r>
-      <w:r>
-        <w:rPr>
-          <w:rFonts w:ascii="Times New Roman" w:eastAsia="SimSun" w:hAnsi="Times New Roman" w:cs="Times New Roman"/>
-          <w:noProof/>
-          <w:lang w:eastAsia="zh-CN"/>
-        </w:rPr>
-        <w:t>)</w:t>
-      </w:r>
-    </w:p>
     <w:sectPr>
-      <w:footerReference w:type="default" r:id="rId21"/>
-      <w:pgSz w:w="12240" w:h="15840"/>
-      <w:pgMar w:top="1440" w:right="1800" w:bottom="1440" w:left="1800" w:header="720" w:footer="720" w:gutter="0"/>
+      <w:footerReference w:type="default" r:id="rId17"/>
+      <w:pgSz w:w="11906" w:h="16838"/>
+      <w:pgMar w:top="1440" w:right="1440" w:bottom="1440" w:left="1440" w:header="708" w:footer="708" w:gutter="0"/>
+      <w:pgNumType w:start="1"/>
       <w:cols w:space="720"/>
-      <w:docGrid w:linePitch="360"/>
     </w:sectPr>
   </w:body>
 </w:document>
@@ -7791,59 +5129,6 @@
 </file>
 
 <file path=word/footer2.xml><?xml version="1.0" encoding="utf-8"?>
-<w:ftr xmlns:wpc="http://schemas.microsoft.com/office/word/2010/wordprocessingCanvas" xmlns:cx="http://schemas.microsoft.com/office/drawing/2014/chartex" xmlns:cx1="http://schemas.microsoft.com/office/drawing/2015/9/8/chartex" xmlns:cx2="http://schemas.microsoft.com/office/drawing/2015/10/21/chartex" xmlns:cx3="http://schemas.microsoft.com/office/drawing/2016/5/9/chartex" xmlns:cx4="http://schemas.microsoft.com/office/drawing/2016/5/10/chartex" xmlns:cx5="http://schemas.microsoft.com/office/drawing/2016/5/11/chartex" xmlns:cx6="http://schemas.microsoft.com/office/drawing/2016/5/12/chartex" xmlns:cx7="http://schemas.microsoft.com/office/drawing/2016/5/13/chartex" xmlns:cx8="http://schemas.microsoft.com/office/drawing/2016/5/14/chartex" xmlns:mc="http://schemas.openxmlformats.org/markup-compatibility/2006" xmlns:aink="http://schemas.microsoft.com/office/drawing/2016/ink" xmlns:am3d="http://schemas.microsoft.com/office/drawing/2017/model3d" xmlns:o="urn:schemas-microsoft-com:office:office" xmlns:oel="http://schemas.microsoft.com/office/2019/extlst" xmlns:r="http://schemas.openxmlformats.org/officeDocument/2006/relationships" xmlns:m="http://schemas.openxmlformats.org/officeDocument/2006/math" xmlns:v="urn:schemas-microsoft-com:vml" xmlns:wp14="http://schemas.microsoft.com/office/word/2010/wordprocessingDrawing" xmlns:wp="http://schemas.openxmlformats.org/drawingml/2006/wordprocessingDrawing" xmlns:w10="urn:schemas-microsoft-com:office:word" xmlns:w="http://schemas.openxmlformats.org/wordprocessingml/2006/main" xmlns:w14="http://schemas.microsoft.com/office/word/2010/wordml" xmlns:w15="http://schemas.microsoft.com/office/word/2012/wordml" xmlns:w16cex="http://schemas.microsoft.com/office/word/2018/wordml/cex" xmlns:w16cid="http://schemas.microsoft.com/office/word/2016/wordml/cid" xmlns:w16="http://schemas.microsoft.com/office/word/2018/wordml" xmlns:w16sdtdh="http://schemas.microsoft.com/office/word/2020/wordml/sdtdatahash" xmlns:w16se="http://schemas.microsoft.com/office/word/2015/wordml/symex" xmlns:wpg="http://schemas.microsoft.com/office/word/2010/wordprocessingGroup" xmlns:wpi="http://schemas.microsoft.com/office/word/2010/wordprocessingInk" xmlns:wne="http://schemas.microsoft.com/office/word/2006/wordml" xmlns:wps="http://schemas.microsoft.com/office/word/2010/wordprocessingShape" mc:Ignorable="w14 w15 w16se w16cid w16 w16cex w16sdtdh wp14">
-  <w:sdt>
-    <w:sdtPr>
-      <w:id w:val="1305970880"/>
-      <w:docPartObj>
-        <w:docPartGallery w:val="Page Numbers (Bottom of Page)"/>
-        <w:docPartUnique/>
-      </w:docPartObj>
-    </w:sdtPr>
-    <w:sdtEndPr>
-      <w:rPr>
-        <w:noProof/>
-      </w:rPr>
-    </w:sdtEndPr>
-    <w:sdtContent>
-      <w:p>
-        <w:pPr>
-          <w:pStyle w:val="Footer"/>
-          <w:jc w:val="center"/>
-        </w:pPr>
-        <w:r>
-          <w:fldChar w:fldCharType="begin"/>
-        </w:r>
-        <w:r>
-          <w:instrText xml:space="preserve"> PAGE   \* MERGEFORMAT </w:instrText>
-        </w:r>
-        <w:r>
-          <w:fldChar w:fldCharType="separate"/>
-        </w:r>
-        <w:r>
-          <w:rPr>
-            <w:noProof/>
-          </w:rPr>
-          <w:t>2</w:t>
-        </w:r>
-        <w:r>
-          <w:rPr>
-            <w:noProof/>
-          </w:rPr>
-          <w:fldChar w:fldCharType="end"/>
-        </w:r>
-      </w:p>
-    </w:sdtContent>
-  </w:sdt>
-  <w:p>
-    <w:pPr>
-      <w:pStyle w:val="Footer"/>
-    </w:pPr>
-  </w:p>
-</w:ftr>
-</file>
-
-<file path=word/footer3.xml><?xml version="1.0" encoding="utf-8"?>
 <w:ftr xmlns:wpc="http://schemas.microsoft.com/office/word/2010/wordprocessingCanvas" xmlns:cx="http://schemas.microsoft.com/office/drawing/2014/chartex" xmlns:cx1="http://schemas.microsoft.com/office/drawing/2015/9/8/chartex" xmlns:cx2="http://schemas.microsoft.com/office/drawing/2015/10/21/chartex" xmlns:cx3="http://schemas.microsoft.com/office/drawing/2016/5/9/chartex" xmlns:cx4="http://schemas.microsoft.com/office/drawing/2016/5/10/chartex" xmlns:cx5="http://schemas.microsoft.com/office/drawing/2016/5/11/chartex" xmlns:cx6="http://schemas.microsoft.com/office/drawing/2016/5/12/chartex" xmlns:cx7="http://schemas.microsoft.com/office/drawing/2016/5/13/chartex" xmlns:cx8="http://schemas.microsoft.com/office/drawing/2016/5/14/chartex" xmlns:mc="http://schemas.openxmlformats.org/markup-compatibility/2006" xmlns:aink="http://schemas.microsoft.com/office/drawing/2016/ink" xmlns:am3d="http://schemas.microsoft.com/office/drawing/2017/model3d" xmlns:o="urn:schemas-microsoft-com:office:office" xmlns:oel="http://schemas.microsoft.com/office/2019/extlst" xmlns:r="http://schemas.openxmlformats.org/officeDocument/2006/relationships" xmlns:m="http://schemas.openxmlformats.org/officeDocument/2006/math" xmlns:v="urn:schemas-microsoft-com:vml" xmlns:wp14="http://schemas.microsoft.com/office/word/2010/wordprocessingDrawing" xmlns:wp="http://schemas.openxmlformats.org/drawingml/2006/wordprocessingDrawing" xmlns:w10="urn:schemas-microsoft-com:office:word" xmlns:w="http://schemas.openxmlformats.org/wordprocessingml/2006/main" xmlns:w14="http://schemas.microsoft.com/office/word/2010/wordml" xmlns:w15="http://schemas.microsoft.com/office/word/2012/wordml" xmlns:w16cex="http://schemas.microsoft.com/office/word/2018/wordml/cex" xmlns:w16cid="http://schemas.microsoft.com/office/word/2016/wordml/cid" xmlns:w16="http://schemas.microsoft.com/office/word/2018/wordml" xmlns:w16sdtdh="http://schemas.microsoft.com/office/word/2020/wordml/sdtdatahash" xmlns:w16se="http://schemas.microsoft.com/office/word/2015/wordml/symex" xmlns:wpg="http://schemas.microsoft.com/office/word/2010/wordprocessingGroup" xmlns:wpi="http://schemas.microsoft.com/office/word/2010/wordprocessingInk" xmlns:wne="http://schemas.microsoft.com/office/word/2006/wordml" xmlns:wps="http://schemas.microsoft.com/office/word/2010/wordprocessingShape" mc:Ignorable="w14 w15 w16se w16cid w16 w16cex w16sdtdh wp14">
   <w:sdt>
     <w:sdtPr>

</xml_diff>

<commit_message>
finish the final proposal
</commit_message>
<xml_diff>
--- a/230482_YangLiu_CA1_Strategic_Thinking_Final Proposal.docx
+++ b/230482_YangLiu_CA1_Strategic_Thinking_Final Proposal.docx
@@ -2,7 +2,6 @@
 <file path=word/document.xml><?xml version="1.0" encoding="utf-8"?>
 <w:document xmlns:wpc="http://schemas.microsoft.com/office/word/2010/wordprocessingCanvas" xmlns:cx="http://schemas.microsoft.com/office/drawing/2014/chartex" xmlns:cx1="http://schemas.microsoft.com/office/drawing/2015/9/8/chartex" xmlns:cx2="http://schemas.microsoft.com/office/drawing/2015/10/21/chartex" xmlns:cx3="http://schemas.microsoft.com/office/drawing/2016/5/9/chartex" xmlns:cx4="http://schemas.microsoft.com/office/drawing/2016/5/10/chartex" xmlns:cx5="http://schemas.microsoft.com/office/drawing/2016/5/11/chartex" xmlns:cx6="http://schemas.microsoft.com/office/drawing/2016/5/12/chartex" xmlns:cx7="http://schemas.microsoft.com/office/drawing/2016/5/13/chartex" xmlns:cx8="http://schemas.microsoft.com/office/drawing/2016/5/14/chartex" xmlns:mc="http://schemas.openxmlformats.org/markup-compatibility/2006" xmlns:aink="http://schemas.microsoft.com/office/drawing/2016/ink" xmlns:am3d="http://schemas.microsoft.com/office/drawing/2017/model3d" xmlns:o="urn:schemas-microsoft-com:office:office" xmlns:oel="http://schemas.microsoft.com/office/2019/extlst" xmlns:r="http://schemas.openxmlformats.org/officeDocument/2006/relationships" xmlns:m="http://schemas.openxmlformats.org/officeDocument/2006/math" xmlns:v="urn:schemas-microsoft-com:vml" xmlns:wp14="http://schemas.microsoft.com/office/word/2010/wordprocessingDrawing" xmlns:wp="http://schemas.openxmlformats.org/drawingml/2006/wordprocessingDrawing" xmlns:w10="urn:schemas-microsoft-com:office:word" xmlns:w="http://schemas.openxmlformats.org/wordprocessingml/2006/main" xmlns:w14="http://schemas.microsoft.com/office/word/2010/wordml" xmlns:w15="http://schemas.microsoft.com/office/word/2012/wordml" xmlns:w16cex="http://schemas.microsoft.com/office/word/2018/wordml/cex" xmlns:w16cid="http://schemas.microsoft.com/office/word/2016/wordml/cid" xmlns:w16="http://schemas.microsoft.com/office/word/2018/wordml" xmlns:w16sdtdh="http://schemas.microsoft.com/office/word/2020/wordml/sdtdatahash" xmlns:w16se="http://schemas.microsoft.com/office/word/2015/wordml/symex" xmlns:wpg="http://schemas.microsoft.com/office/word/2010/wordprocessingGroup" xmlns:wpi="http://schemas.microsoft.com/office/word/2010/wordprocessingInk" xmlns:wne="http://schemas.microsoft.com/office/word/2006/wordml" xmlns:wps="http://schemas.microsoft.com/office/word/2010/wordprocessingShape" mc:Ignorable="w14 w15 w16se w16cid w16 w16cex w16sdtdh wp14">
   <w:body>
-    <w:bookmarkStart w:id="0" w:name="_Toc243498872"/>
     <w:p>
       <w:pPr>
         <w:pStyle w:val="Heading1"/>
@@ -10,6 +9,7 @@
           <w:rFonts w:ascii="Times New Roman" w:hAnsi="Times New Roman" w:cs="Times New Roman"/>
         </w:rPr>
       </w:pPr>
+      <w:bookmarkStart w:id="0" w:name="_Toc243498872"/>
       <w:r>
         <w:rPr>
           <w:rFonts w:ascii="Times New Roman" w:hAnsi="Times New Roman" w:cs="Times New Roman"/>
@@ -647,7 +647,39 @@
                 <w:szCs w:val="28"/>
                 <w:u w:val="single"/>
               </w:rPr>
-              <w:t>Analytics for Labor Optimization in Hospitality I</w:t>
+              <w:t xml:space="preserve">Analytics for </w:t>
+            </w:r>
+            <w:proofErr w:type="spellStart"/>
+            <w:r>
+              <w:rPr>
+                <w:rFonts w:ascii="Times New Roman" w:hAnsi="Times New Roman" w:cs="Times New Roman"/>
+                <w:i/>
+                <w:sz w:val="28"/>
+                <w:szCs w:val="28"/>
+                <w:u w:val="single"/>
+              </w:rPr>
+              <w:t>Lab</w:t>
+            </w:r>
+            <w:r>
+              <w:rPr>
+                <w:rFonts w:ascii="Times New Roman" w:hAnsi="Times New Roman" w:cs="Times New Roman"/>
+                <w:i/>
+                <w:sz w:val="28"/>
+                <w:szCs w:val="28"/>
+                <w:u w:val="single"/>
+              </w:rPr>
+              <w:t>our</w:t>
+            </w:r>
+            <w:proofErr w:type="spellEnd"/>
+            <w:r>
+              <w:rPr>
+                <w:rFonts w:ascii="Times New Roman" w:hAnsi="Times New Roman" w:cs="Times New Roman"/>
+                <w:i/>
+                <w:sz w:val="28"/>
+                <w:szCs w:val="28"/>
+                <w:u w:val="single"/>
+              </w:rPr>
+              <w:t xml:space="preserve"> Optimization in Hospitality I</w:t>
             </w:r>
             <w:r>
               <w:rPr>
@@ -3937,6 +3969,44 @@
             </a:graphic>
           </wp:inline>
         </w:drawing>
+      </w:r>
+    </w:p>
+    <w:p>
+      <w:pPr>
+        <w:jc w:val="center"/>
+        <w:rPr>
+          <w:rFonts w:ascii="Times New Roman" w:hAnsi="Times New Roman" w:cs="Times New Roman"/>
+          <w:sz w:val="20"/>
+          <w:szCs w:val="20"/>
+          <w:lang w:eastAsia="zh-CN"/>
+        </w:rPr>
+      </w:pPr>
+      <w:r>
+        <w:rPr>
+          <w:rFonts w:ascii="Times New Roman" w:hAnsi="Times New Roman" w:cs="Times New Roman"/>
+          <w:sz w:val="20"/>
+          <w:szCs w:val="20"/>
+          <w:lang w:eastAsia="zh-CN"/>
+        </w:rPr>
+        <w:t>(</w:t>
+      </w:r>
+      <w:r>
+        <w:rPr>
+          <w:rFonts w:ascii="Times New Roman" w:hAnsi="Times New Roman" w:cs="Times New Roman"/>
+          <w:sz w:val="20"/>
+          <w:szCs w:val="20"/>
+          <w:lang w:eastAsia="zh-CN"/>
+        </w:rPr>
+        <w:t>Overall Workflow</w:t>
+      </w:r>
+      <w:r>
+        <w:rPr>
+          <w:rFonts w:ascii="Times New Roman" w:hAnsi="Times New Roman" w:cs="Times New Roman"/>
+          <w:sz w:val="20"/>
+          <w:szCs w:val="20"/>
+          <w:lang w:eastAsia="zh-CN"/>
+        </w:rPr>
+        <w:t>)</w:t>
       </w:r>
     </w:p>
     <w:p>

</xml_diff>